<commit_message>
Rapport journalier n°10 — Version finale avec 29 figures
- Rapport Word (.docx) : 29 images intégrées
- Rapport PDF
- 25 captures auto-générées
- Page de garde avec logo yCogniCore Cloud

Réf. : Sprint H0 clôturé (6/6)
</commit_message>
<xml_diff>
--- a/docs/rapports/export/Rapport_Journalier_n10.docx
+++ b/docs/rapports/export/Rapport_Journalier_n10.docx
@@ -28,122 +28,6 @@
         </w:p>
       </w:sdtContent>
     </w:sdt>
-    <w:bookmarkStart w:id="121" w:name="rapport-journalier-n10"/>
-    <w:p>
-      <w:pPr>
-        <w:pStyle w:val="Heading1"/>
-      </w:pPr>
-      <w:r>
-        <w:rPr>
-          <w:rStyle w:val="SectionNumber"/>
-        </w:rPr>
-        <w:t xml:space="preserve">1</w:t>
-      </w:r>
-      <w:r>
-        <w:tab/>
-      </w:r>
-      <w:r>
-        <w:t xml:space="preserve">Rapport Journalier n°10</w:t>
-      </w:r>
-    </w:p>
-    <w:p>
-      <w:pPr>
-        <w:pStyle w:val="FirstParagraph"/>
-      </w:pPr>
-      <w:r>
-        <w:rPr>
-          <w:b/>
-          <w:bCs/>
-        </w:rPr>
-        <w:t xml:space="preserve">Projet :</w:t>
-      </w:r>
-      <w:r>
-        <w:t xml:space="preserve"> </w:t>
-      </w:r>
-      <w:r>
-        <w:t xml:space="preserve">yCogniCore Cloud — Plateforme ERP SaaS</w:t>
-      </w:r>
-      <w:r>
-        <w:t xml:space="preserve"> </w:t>
-      </w:r>
-      <w:r>
-        <w:rPr>
-          <w:b/>
-          <w:bCs/>
-        </w:rPr>
-        <w:t xml:space="preserve">Phase :</w:t>
-      </w:r>
-      <w:r>
-        <w:t xml:space="preserve"> </w:t>
-      </w:r>
-      <w:r>
-        <w:t xml:space="preserve">Phase 1 — Socle Invariable</w:t>
-      </w:r>
-      <w:r>
-        <w:t xml:space="preserve"> </w:t>
-      </w:r>
-      <w:r>
-        <w:rPr>
-          <w:b/>
-          <w:bCs/>
-        </w:rPr>
-        <w:t xml:space="preserve">Date :</w:t>
-      </w:r>
-      <w:r>
-        <w:t xml:space="preserve"> </w:t>
-      </w:r>
-      <w:r>
-        <w:t xml:space="preserve">30 septembre 2026</w:t>
-      </w:r>
-      <w:r>
-        <w:t xml:space="preserve"> </w:t>
-      </w:r>
-      <w:r>
-        <w:rPr>
-          <w:b/>
-          <w:bCs/>
-        </w:rPr>
-        <w:t xml:space="preserve">Auteur :</w:t>
-      </w:r>
-      <w:r>
-        <w:t xml:space="preserve"> </w:t>
-      </w:r>
-      <w:r>
-        <w:t xml:space="preserve">Yameogo Idrissa</w:t>
-      </w:r>
-      <w:r>
-        <w:t xml:space="preserve"> </w:t>
-      </w:r>
-      <w:r>
-        <w:rPr>
-          <w:b/>
-          <w:bCs/>
-        </w:rPr>
-        <w:t xml:space="preserve">Version :</w:t>
-      </w:r>
-      <w:r>
-        <w:t xml:space="preserve"> </w:t>
-      </w:r>
-      <w:r>
-        <w:t xml:space="preserve">2.0</w:t>
-      </w:r>
-      <w:r>
-        <w:t xml:space="preserve"> </w:t>
-      </w:r>
-      <w:r>
-        <w:rPr>
-          <w:b/>
-          <w:bCs/>
-        </w:rPr>
-        <w:t xml:space="preserve">Statut :</w:t>
-      </w:r>
-      <w:r>
-        <w:t xml:space="preserve"> </w:t>
-      </w:r>
-      <w:r>
-        <w:t xml:space="preserve">Sprint H0 clôturé (6/6 points)</w:t>
-      </w:r>
-    </w:p>
     <w:p>
       <w:r>
         <w:pict>
@@ -151,7 +35,7 @@
         </w:pict>
       </w:r>
     </w:p>
-    <w:bookmarkStart w:id="9" w:name="table-des-matières"/>
+    <w:bookmarkStart w:id="13" w:name="table-des-matières"/>
     <w:p>
       <w:pPr>
         <w:pStyle w:val="Heading2"/>
@@ -160,7 +44,7 @@
         <w:rPr>
           <w:rStyle w:val="SectionNumber"/>
         </w:rPr>
-        <w:t xml:space="preserve">1.1</w:t>
+        <w:t xml:space="preserve">1</w:t>
       </w:r>
       <w:r>
         <w:tab/>
@@ -288,6 +172,145 @@
         </w:r>
       </w:hyperlink>
     </w:p>
+    <w:tbl>
+      <w:tblPr>
+        <w:tblStyle w:val="Table"/>
+        <w:tblW w:type="pct" w:w="278"/>
+        <w:tblLayout w:type="fixed"/>
+        <w:tblLook w:firstRow="0" w:lastRow="0" w:firstColumn="0" w:lastColumn="0" w:noHBand="0" w:noVBand="0" w:val="0000"/>
+      </w:tblPr>
+      <w:tblGrid>
+        <w:gridCol w:w="440"/>
+      </w:tblGrid>
+      <w:tr>
+        <w:tc>
+          <w:tcPr/>
+          <w:p>
+            <w:pPr>
+              <w:pStyle w:val="Compact"/>
+            </w:pPr>
+          </w:p>
+        </w:tc>
+      </w:tr>
+      <w:tr>
+        <w:tc>
+          <w:tcPr/>
+          <w:p>
+            <w:pPr>
+              <w:pStyle w:val="Compact"/>
+            </w:pPr>
+            <w:r>
+              <w:drawing>
+                <wp:inline>
+                  <wp:extent cx="5334000" cy="2133600"/>
+                  <wp:effectExtent b="0" l="0" r="0" t="0"/>
+                  <wp:docPr descr="Logo yCogniCore Cloud" title="" id="10" name="Picture"/>
+                  <a:graphic>
+                    <a:graphicData uri="http://schemas.openxmlformats.org/drawingml/2006/picture">
+                      <pic:pic>
+                        <pic:nvPicPr>
+                          <pic:cNvPr descr="/home/idrissa_yameogo/projets/ycognicore-cloud/docs/rapports/assets/logo.png" id="11" name="Picture"/>
+                          <pic:cNvPicPr>
+                            <a:picLocks noChangeArrowheads="1" noChangeAspect="1"/>
+                          </pic:cNvPicPr>
+                        </pic:nvPicPr>
+                        <pic:blipFill>
+                          <a:blip r:embed="rId9"/>
+                          <a:stretch>
+                            <a:fillRect/>
+                          </a:stretch>
+                        </pic:blipFill>
+                        <pic:spPr bwMode="auto">
+                          <a:xfrm>
+                            <a:off x="0" y="0"/>
+                            <a:ext cx="5334000" cy="2133600"/>
+                          </a:xfrm>
+                          <a:prstGeom prst="rect">
+                            <a:avLst/>
+                          </a:prstGeom>
+                          <a:noFill/>
+                          <a:ln w="9525">
+                            <a:noFill/>
+                            <a:headEnd/>
+                            <a:tailEnd/>
+                          </a:ln>
+                        </pic:spPr>
+                      </pic:pic>
+                    </a:graphicData>
+                  </a:graphic>
+                </wp:inline>
+              </w:drawing>
+            </w:r>
+          </w:p>
+        </w:tc>
+      </w:tr>
+      <w:tr>
+        <w:tc>
+          <w:tcPr/>
+          <w:p>
+            <w:pPr>
+              <w:pStyle w:val="Compact"/>
+            </w:pPr>
+            <w:r>
+              <w:t xml:space="preserve">#</w:t>
+            </w:r>
+            <w:r>
+              <w:t xml:space="preserve"> </w:t>
+            </w:r>
+            <w:r>
+              <w:rPr>
+                <w:b/>
+                <w:bCs/>
+              </w:rPr>
+              <w:t xml:space="preserve">yCogniCore Cloud</w:t>
+            </w:r>
+          </w:p>
+        </w:tc>
+      </w:tr>
+      <w:tr>
+        <w:tc>
+          <w:tcPr/>
+          <w:p>
+            <w:pPr>
+              <w:pStyle w:val="Compact"/>
+            </w:pPr>
+            <w:r>
+              <w:t xml:space="preserve">## Plateforme ERP SaaS multi-tenant</w:t>
+            </w:r>
+          </w:p>
+        </w:tc>
+      </w:tr>
+    </w:tbl>
+    <w:bookmarkStart w:id="12" w:name="rapport-journalier-n10"/>
+    <w:p>
+      <w:pPr>
+        <w:pStyle w:val="Heading3"/>
+      </w:pPr>
+      <w:r>
+        <w:rPr>
+          <w:rStyle w:val="SectionNumber"/>
+        </w:rPr>
+        <w:t xml:space="preserve">1.1</w:t>
+      </w:r>
+      <w:r>
+        <w:tab/>
+      </w:r>
+      <w:r>
+        <w:t xml:space="preserve">Rapport Journalier n°10</w:t>
+      </w:r>
+    </w:p>
+    <w:p>
+      <w:pPr>
+        <w:pStyle w:val="FirstParagraph"/>
+      </w:pPr>
+      <w:r>
+        <w:rPr>
+          <w:b/>
+          <w:bCs/>
+        </w:rPr>
+        <w:t xml:space="preserve">Sprint H0 — Socle Invariable</w:t>
+      </w:r>
+    </w:p>
     <w:p>
       <w:r>
         <w:pict>
@@ -295,8 +318,78 @@
         </w:pict>
       </w:r>
     </w:p>
-    <w:bookmarkEnd w:id="9"/>
-    <w:bookmarkStart w:id="13" w:name="contexte-de-la-journée"/>
+    <w:p>
+      <w:pPr>
+        <w:pStyle w:val="FirstParagraph"/>
+      </w:pPr>
+      <w:r>
+        <w:rPr>
+          <w:b/>
+          <w:bCs/>
+        </w:rPr>
+        <w:t xml:space="preserve">Auteur :</w:t>
+      </w:r>
+      <w:r>
+        <w:t xml:space="preserve"> </w:t>
+      </w:r>
+      <w:r>
+        <w:t xml:space="preserve">Yameogo Idrissa</w:t>
+      </w:r>
+      <w:r>
+        <w:t xml:space="preserve"> </w:t>
+      </w:r>
+      <w:r>
+        <w:rPr>
+          <w:b/>
+          <w:bCs/>
+        </w:rPr>
+        <w:t xml:space="preserve">Date :</w:t>
+      </w:r>
+      <w:r>
+        <w:t xml:space="preserve"> </w:t>
+      </w:r>
+      <w:r>
+        <w:t xml:space="preserve">30 septembre 2026</w:t>
+      </w:r>
+      <w:r>
+        <w:t xml:space="preserve"> </w:t>
+      </w:r>
+      <w:r>
+        <w:rPr>
+          <w:b/>
+          <w:bCs/>
+        </w:rPr>
+        <w:t xml:space="preserve">Version :</w:t>
+      </w:r>
+      <w:r>
+        <w:t xml:space="preserve"> </w:t>
+      </w:r>
+      <w:r>
+        <w:t xml:space="preserve">2.0</w:t>
+      </w:r>
+    </w:p>
+    <w:p>
+      <w:r>
+        <w:pict>
+          <v:rect style="width:0;height:1.5pt" o:hralign="center" o:hrstd="t" o:hr="t"/>
+        </w:pict>
+      </w:r>
+    </w:p>
+    <w:p>
+      <w:pPr>
+        <w:pStyle w:val="FirstParagraph"/>
+      </w:pPr>
+      <w:r>
+        <w:rPr>
+          <w:i/>
+          <w:iCs/>
+        </w:rPr>
+        <w:t xml:space="preserve">Document confidentiel — Stage SOCIETE BENJEDDOU TECHNOLOGIE</w:t>
+      </w:r>
+    </w:p>
+    <w:bookmarkEnd w:id="12"/>
+    <w:bookmarkEnd w:id="13"/>
+    <w:bookmarkStart w:id="17" w:name="contexte-de-la-journée"/>
     <w:p>
       <w:pPr>
         <w:pStyle w:val="Heading2"/>
@@ -305,7 +398,7 @@
         <w:rPr>
           <w:rStyle w:val="SectionNumber"/>
         </w:rPr>
-        <w:t xml:space="preserve">1.2</w:t>
+        <w:t xml:space="preserve">2</w:t>
       </w:r>
       <w:r>
         <w:tab/>
@@ -314,7 +407,7 @@
         <w:t xml:space="preserve">1. Contexte de la journée</w:t>
       </w:r>
     </w:p>
-    <w:bookmarkStart w:id="10" w:name="situation-dentrée"/>
+    <w:bookmarkStart w:id="14" w:name="situation-dentrée"/>
     <w:p>
       <w:pPr>
         <w:pStyle w:val="Heading3"/>
@@ -323,7 +416,7 @@
         <w:rPr>
           <w:rStyle w:val="SectionNumber"/>
         </w:rPr>
-        <w:t xml:space="preserve">1.2.1</w:t>
+        <w:t xml:space="preserve">2.1</w:t>
       </w:r>
       <w:r>
         <w:tab/>
@@ -583,8 +676,8 @@
         <w:t xml:space="preserve">du Sprint H0 restaient à traiter pour permettre le démarrage de l’implémentation Spring Boot.</w:t>
       </w:r>
     </w:p>
-    <w:bookmarkEnd w:id="10"/>
-    <w:bookmarkStart w:id="11" w:name="objectifs-de-la-journée"/>
+    <w:bookmarkEnd w:id="14"/>
+    <w:bookmarkStart w:id="15" w:name="objectifs-de-la-journée"/>
     <w:p>
       <w:pPr>
         <w:pStyle w:val="Heading3"/>
@@ -593,7 +686,7 @@
         <w:rPr>
           <w:rStyle w:val="SectionNumber"/>
         </w:rPr>
-        <w:t xml:space="preserve">1.2.2</w:t>
+        <w:t xml:space="preserve">2.2</w:t>
       </w:r>
       <w:r>
         <w:tab/>
@@ -864,8 +957,8 @@
         <w:t xml:space="preserve">le Sprint H0 conditionne l’intégralité du Sprint H1 (Backend socle). Sans la clôture de H0, aucun développement Spring Boot ne peut démarrer.</w:t>
       </w:r>
     </w:p>
-    <w:bookmarkEnd w:id="11"/>
-    <w:bookmarkStart w:id="12" w:name="contraintes-imposées"/>
+    <w:bookmarkEnd w:id="15"/>
+    <w:bookmarkStart w:id="16" w:name="contraintes-imposées"/>
     <w:p>
       <w:pPr>
         <w:pStyle w:val="Heading3"/>
@@ -874,7 +967,7 @@
         <w:rPr>
           <w:rStyle w:val="SectionNumber"/>
         </w:rPr>
-        <w:t xml:space="preserve">1.2.3</w:t>
+        <w:t xml:space="preserve">2.3</w:t>
       </w:r>
       <w:r>
         <w:tab/>
@@ -938,9 +1031,9 @@
         </w:pict>
       </w:r>
     </w:p>
-    <w:bookmarkEnd w:id="12"/>
-    <w:bookmarkEnd w:id="13"/>
-    <w:bookmarkStart w:id="86" w:name="tâches-réalisées-et-leur-déroulement"/>
+    <w:bookmarkEnd w:id="16"/>
+    <w:bookmarkEnd w:id="17"/>
+    <w:bookmarkStart w:id="108" w:name="tâches-réalisées-et-leur-déroulement"/>
     <w:p>
       <w:pPr>
         <w:pStyle w:val="Heading2"/>
@@ -949,7 +1042,7 @@
         <w:rPr>
           <w:rStyle w:val="SectionNumber"/>
         </w:rPr>
-        <w:t xml:space="preserve">1.3</w:t>
+        <w:t xml:space="preserve">3</w:t>
       </w:r>
       <w:r>
         <w:tab/>
@@ -979,7 +1072,7 @@
         <w:t xml:space="preserve">, chacun avec des objectifs mesurables et des livrables précis.</w:t>
       </w:r>
     </w:p>
-    <w:bookmarkStart w:id="14" w:name="vue-densemble"/>
+    <w:bookmarkStart w:id="18" w:name="vue-densemble"/>
     <w:p>
       <w:pPr>
         <w:pStyle w:val="Heading3"/>
@@ -988,7 +1081,7 @@
         <w:rPr>
           <w:rStyle w:val="SectionNumber"/>
         </w:rPr>
-        <w:t xml:space="preserve">1.3.1</w:t>
+        <w:t xml:space="preserve">3.1</w:t>
       </w:r>
       <w:r>
         <w:tab/>
@@ -1389,8 +1482,8 @@
         </w:pict>
       </w:r>
     </w:p>
-    <w:bookmarkEnd w:id="14"/>
-    <w:bookmarkStart w:id="20" w:name="Xb897b160a1e9df8a28041411326a7523064b457"/>
+    <w:bookmarkEnd w:id="18"/>
+    <w:bookmarkStart w:id="39" w:name="Xb897b160a1e9df8a28041411326a7523064b457"/>
     <w:p>
       <w:pPr>
         <w:pStyle w:val="Heading3"/>
@@ -1399,7 +1492,7 @@
         <w:rPr>
           <w:rStyle w:val="SectionNumber"/>
         </w:rPr>
-        <w:t xml:space="preserve">1.3.2</w:t>
+        <w:t xml:space="preserve">3.2</w:t>
       </w:r>
       <w:r>
         <w:tab/>
@@ -1562,20 +1655,20 @@
       <w:r>
         <w:drawing>
           <wp:inline>
-            <wp:extent cx="5334000" cy="1787419"/>
+            <wp:extent cx="5334000" cy="1740568"/>
             <wp:effectExtent b="0" l="0" r="0" t="0"/>
-            <wp:docPr descr="Arborescence initiale" title="" id="16" name="Picture"/>
+            <wp:docPr descr="Arborescence initiale" title="" id="20" name="Picture"/>
             <a:graphic>
               <a:graphicData uri="http://schemas.openxmlformats.org/drawingml/2006/picture">
                 <pic:pic>
                   <pic:nvPicPr>
-                    <pic:cNvPr descr="/home/idrissa_yameogo/projets/ycognicore-cloud/docs/rapports/captures/10/04-13-migrations.png" id="17" name="Picture"/>
+                    <pic:cNvPr descr="/home/idrissa_yameogo/projets/ycognicore-cloud/docs/rapports/captures/10/04-13-migrations.png" id="21" name="Picture"/>
                     <pic:cNvPicPr>
                       <a:picLocks noChangeArrowheads="1" noChangeAspect="1"/>
                     </pic:cNvPicPr>
                   </pic:nvPicPr>
                   <pic:blipFill>
-                    <a:blip r:embed="rId15"/>
+                    <a:blip r:embed="rId19"/>
                     <a:stretch>
                       <a:fillRect/>
                     </a:stretch>
@@ -1583,7 +1676,7 @@
                   <pic:spPr bwMode="auto">
                     <a:xfrm>
                       <a:off x="0" y="0"/>
-                      <a:ext cx="5334000" cy="1787419"/>
+                      <a:ext cx="5334000" cy="1740568"/>
                     </a:xfrm>
                     <a:prstGeom prst="rect">
                       <a:avLst/>
@@ -1629,20 +1722,20 @@
       <w:r>
         <w:drawing>
           <wp:inline>
-            <wp:extent cx="5334000" cy="1787419"/>
+            <wp:extent cx="5334000" cy="1740568"/>
             <wp:effectExtent b="0" l="0" r="0" t="0"/>
-            <wp:docPr descr="Sauvegarde et reconstruction" title="" id="18" name="Picture"/>
+            <wp:docPr descr="Sauvegarde et reconstruction" title="" id="22" name="Picture"/>
             <a:graphic>
               <a:graphicData uri="http://schemas.openxmlformats.org/drawingml/2006/picture">
                 <pic:pic>
                   <pic:nvPicPr>
-                    <pic:cNvPr descr="/home/idrissa_yameogo/projets/ycognicore-cloud/docs/rapports/captures/10/04-13-migrations.png" id="19" name="Picture"/>
+                    <pic:cNvPr descr="/home/idrissa_yameogo/projets/ycognicore-cloud/docs/rapports/captures/10/04-13-migrations.png" id="23" name="Picture"/>
                     <pic:cNvPicPr>
                       <a:picLocks noChangeArrowheads="1" noChangeAspect="1"/>
                     </pic:cNvPicPr>
                   </pic:nvPicPr>
                   <pic:blipFill>
-                    <a:blip r:embed="rId15"/>
+                    <a:blip r:embed="rId19"/>
                     <a:stretch>
                       <a:fillRect/>
                     </a:stretch>
@@ -1650,7 +1743,7 @@
                   <pic:spPr bwMode="auto">
                     <a:xfrm>
                       <a:off x="0" y="0"/>
-                      <a:ext cx="5334000" cy="1787419"/>
+                      <a:ext cx="5334000" cy="1740568"/>
                     </a:xfrm>
                     <a:prstGeom prst="rect">
                       <a:avLst/>
@@ -1709,228 +1802,25 @@
     </w:p>
     <w:p>
       <w:pPr>
-        <w:pStyle w:val="BodyText"/>
-      </w:pPr>
-      <w:r>
-        <w:rPr>
-          <w:b/>
-          <w:bCs/>
-        </w:rPr>
-        <w:t xml:space="preserve">Durée effective :</w:t>
-      </w:r>
-      <w:r>
-        <w:t xml:space="preserve"> </w:t>
-      </w:r>
-      <w:r>
-        <w:t xml:space="preserve">30 minutes.</w:t>
-      </w:r>
-    </w:p>
-    <w:p>
-      <w:r>
-        <w:pict>
-          <v:rect style="width:0;height:1.5pt" o:hralign="center" o:hrstd="t" o:hr="t"/>
-        </w:pict>
-      </w:r>
-    </w:p>
-    <w:bookmarkEnd w:id="20"/>
-    <w:bookmarkStart w:id="23" w:name="Xeaa754c95fae8af11526b220e4a3b82cfe7b57a"/>
-    <w:p>
-      <w:pPr>
-        <w:pStyle w:val="Heading3"/>
-      </w:pPr>
-      <w:r>
-        <w:rPr>
-          <w:rStyle w:val="SectionNumber"/>
-        </w:rPr>
-        <w:t xml:space="preserve">1.3.3</w:t>
-      </w:r>
-      <w:r>
-        <w:tab/>
-      </w:r>
-      <w:r>
-        <w:t xml:space="preserve">Tâche 2 — Reconstruction des 13 migrations SQL (BLOC 1)</w:t>
-      </w:r>
-    </w:p>
-    <w:p>
-      <w:pPr>
-        <w:pStyle w:val="FirstParagraph"/>
-      </w:pPr>
-      <w:r>
-        <w:rPr>
-          <w:b/>
-          <w:bCs/>
-        </w:rPr>
-        <w:t xml:space="preserve">Objectif :</w:t>
-      </w:r>
-      <w:r>
-        <w:t xml:space="preserve"> </w:t>
-      </w:r>
-      <w:r>
-        <w:t xml:space="preserve">reconstruire proprement les 13 migrations SQL selon l’Approche A.</w:t>
-      </w:r>
-    </w:p>
-    <w:p>
-      <w:pPr>
-        <w:pStyle w:val="BodyText"/>
-      </w:pPr>
-      <w:r>
-        <w:rPr>
-          <w:b/>
-          <w:bCs/>
-        </w:rPr>
-        <w:t xml:space="preserve">Déroulement :</w:t>
-      </w:r>
-    </w:p>
-    <w:p>
-      <w:pPr>
-        <w:numPr>
-          <w:ilvl w:val="0"/>
-          <w:numId w:val="1004"/>
-        </w:numPr>
-      </w:pPr>
-      <w:r>
-        <w:rPr>
-          <w:b/>
-          <w:bCs/>
-        </w:rPr>
-        <w:t xml:space="preserve">Control Plane (6 migrations)</w:t>
-      </w:r>
-      <w:r>
-        <w:t xml:space="preserve"> </w:t>
-      </w:r>
-      <w:r>
-        <w:t xml:space="preserve">: V1 à V6 (socle, abonnements, quotas IA, transversales, sécurité Superadmin, enrichissements).</w:t>
-      </w:r>
-    </w:p>
-    <w:p>
-      <w:pPr>
-        <w:numPr>
-          <w:ilvl w:val="0"/>
-          <w:numId w:val="1004"/>
-        </w:numPr>
-      </w:pPr>
-      <w:r>
-        <w:rPr>
-          <w:b/>
-          <w:bCs/>
-        </w:rPr>
-        <w:t xml:space="preserve">Tenant (7 migrations)</w:t>
-      </w:r>
-      <w:r>
-        <w:t xml:space="preserve"> </w:t>
-      </w:r>
-      <w:r>
-        <w:t xml:space="preserve">: V1 à V7 (socle RBAC, password history, login attempts, extensions, enrichissements, verrouillage).</w:t>
-      </w:r>
-    </w:p>
-    <w:p>
-      <w:pPr>
-        <w:numPr>
-          <w:ilvl w:val="0"/>
-          <w:numId w:val="1004"/>
-        </w:numPr>
-      </w:pPr>
-      <w:r>
-        <w:rPr>
-          <w:b/>
-          <w:bCs/>
-        </w:rPr>
-        <w:t xml:space="preserve">Vérification par fichier</w:t>
-      </w:r>
-      <w:r>
-        <w:t xml:space="preserve"> </w:t>
-      </w:r>
-      <w:r>
-        <w:t xml:space="preserve">: comptage des</w:t>
-      </w:r>
-      <w:r>
-        <w:t xml:space="preserve"> </w:t>
-      </w:r>
-      <w:r>
-        <w:rPr>
-          <w:rStyle w:val="VerbatimChar"/>
-        </w:rPr>
-        <w:t xml:space="preserve">CREATE TABLE</w:t>
-      </w:r>
-      <w:r>
-        <w:t xml:space="preserve">,</w:t>
-      </w:r>
-      <w:r>
-        <w:t xml:space="preserve"> </w:t>
-      </w:r>
-      <w:r>
-        <w:rPr>
-          <w:rStyle w:val="VerbatimChar"/>
-        </w:rPr>
-        <w:t xml:space="preserve">CREATE FUNCTION</w:t>
-      </w:r>
-      <w:r>
-        <w:t xml:space="preserve">,</w:t>
-      </w:r>
-      <w:r>
-        <w:t xml:space="preserve"> </w:t>
-      </w:r>
-      <w:r>
-        <w:rPr>
-          <w:rStyle w:val="VerbatimChar"/>
-        </w:rPr>
-        <w:t xml:space="preserve">CREATE TRIGGER</w:t>
-      </w:r>
-      <w:r>
-        <w:t xml:space="preserve">,</w:t>
-      </w:r>
-      <w:r>
-        <w:t xml:space="preserve"> </w:t>
-      </w:r>
-      <w:r>
-        <w:rPr>
-          <w:rStyle w:val="VerbatimChar"/>
-        </w:rPr>
-        <w:t xml:space="preserve">CREATE INDEX</w:t>
-      </w:r>
-      <w:r>
-        <w:t xml:space="preserve">.</w:t>
-      </w:r>
-    </w:p>
-    <w:p>
-      <w:pPr>
-        <w:pStyle w:val="FirstParagraph"/>
-      </w:pPr>
-      <w:r>
-        <w:rPr>
-          <w:b/>
-          <w:bCs/>
-        </w:rPr>
-        <w:t xml:space="preserve">Résultat :</w:t>
-      </w:r>
-      <w:r>
-        <w:t xml:space="preserve"> </w:t>
-      </w:r>
-      <w:r>
-        <w:t xml:space="preserve">13 fichiers SQL (6 CP + 7 Tenant) + 1 vérificateur.</w:t>
-      </w:r>
-    </w:p>
-    <w:p>
-      <w:pPr>
         <w:pStyle w:val="CaptionedFigure"/>
       </w:pPr>
       <w:r>
         <w:drawing>
           <wp:inline>
-            <wp:extent cx="5334000" cy="1787419"/>
+            <wp:extent cx="5334000" cy="1866899"/>
             <wp:effectExtent b="0" l="0" r="0" t="0"/>
-            <wp:docPr descr="13 migrations finales" title="" id="21" name="Picture"/>
+            <wp:docPr descr="Création de la sauvegarde horodatée db.backup-20260930-094319/." title="" id="25" name="Picture"/>
             <a:graphic>
               <a:graphicData uri="http://schemas.openxmlformats.org/drawingml/2006/picture">
                 <pic:pic>
                   <pic:nvPicPr>
-                    <pic:cNvPr descr="/home/idrissa_yameogo/projets/ycognicore-cloud/docs/rapports/captures/10/04-13-migrations.png" id="22" name="Picture"/>
+                    <pic:cNvPr descr="/home/idrissa_yameogo/projets/ycognicore-cloud/docs/rapports/captures/10/03-sauvegarde.png" id="26" name="Picture"/>
                     <pic:cNvPicPr>
                       <a:picLocks noChangeArrowheads="1" noChangeAspect="1"/>
                     </pic:cNvPicPr>
                   </pic:nvPicPr>
                   <pic:blipFill>
-                    <a:blip r:embed="rId15"/>
+                    <a:blip r:embed="rId24"/>
                     <a:stretch>
                       <a:fillRect/>
                     </a:stretch>
@@ -1938,7 +1828,7 @@
                   <pic:spPr bwMode="auto">
                     <a:xfrm>
                       <a:off x="0" y="0"/>
-                      <a:ext cx="5334000" cy="1787419"/>
+                      <a:ext cx="5334000" cy="1866899"/>
                     </a:xfrm>
                     <a:prstGeom prst="rect">
                       <a:avLst/>
@@ -1962,7 +1852,7 @@
         <w:pStyle w:val="ImageCaption"/>
       </w:pPr>
       <w:r>
-        <w:t xml:space="preserve">13 migrations finales</w:t>
+        <w:t xml:space="preserve">Création de la sauvegarde horodatée db.backup-20260930-094319/.</w:t>
       </w:r>
     </w:p>
     <w:p>
@@ -1974,398 +1864,7 @@
           <w:i/>
           <w:iCs/>
         </w:rPr>
-        <w:t xml:space="preserve">Figure 3 — Vérification finale : 6 migrations CP + 7 Tenant = 13.</w:t>
-      </w:r>
-    </w:p>
-    <w:p>
-      <w:pPr>
-        <w:pStyle w:val="BodyText"/>
-      </w:pPr>
-      <w:r>
-        <w:rPr>
-          <w:b/>
-          <w:bCs/>
-        </w:rPr>
-        <w:t xml:space="preserve">Durée effective :</w:t>
-      </w:r>
-      <w:r>
-        <w:t xml:space="preserve"> </w:t>
-      </w:r>
-      <w:r>
-        <w:t xml:space="preserve">1 heure 30.</w:t>
-      </w:r>
-    </w:p>
-    <w:p>
-      <w:r>
-        <w:pict>
-          <v:rect style="width:0;height:1.5pt" o:hralign="center" o:hrstd="t" o:hr="t"/>
-        </w:pict>
-      </w:r>
-    </w:p>
-    <w:bookmarkEnd w:id="23"/>
-    <w:bookmarkStart w:id="26" w:name="tâche-3-décisions-technologiques-bloc-2"/>
-    <w:p>
-      <w:pPr>
-        <w:pStyle w:val="Heading3"/>
-      </w:pPr>
-      <w:r>
-        <w:rPr>
-          <w:rStyle w:val="SectionNumber"/>
-        </w:rPr>
-        <w:t xml:space="preserve">1.3.4</w:t>
-      </w:r>
-      <w:r>
-        <w:tab/>
-      </w:r>
-      <w:r>
-        <w:t xml:space="preserve">Tâche 3 — Décisions technologiques (BLOC 2)</w:t>
-      </w:r>
-    </w:p>
-    <w:bookmarkStart w:id="24" w:name="adr-008-choix-de-spring-boot-4"/>
-    <w:p>
-      <w:pPr>
-        <w:pStyle w:val="Heading4"/>
-      </w:pPr>
-      <w:r>
-        <w:rPr>
-          <w:rStyle w:val="SectionNumber"/>
-        </w:rPr>
-        <w:t xml:space="preserve">1.3.4.1</w:t>
-      </w:r>
-      <w:r>
-        <w:tab/>
-      </w:r>
-      <w:r>
-        <w:t xml:space="preserve">3.1. ADR-008 — Choix de Spring Boot 4</w:t>
-      </w:r>
-    </w:p>
-    <w:p>
-      <w:pPr>
-        <w:pStyle w:val="FirstParagraph"/>
-      </w:pPr>
-      <w:r>
-        <w:rPr>
-          <w:b/>
-          <w:bCs/>
-        </w:rPr>
-        <w:t xml:space="preserve">Décision :</w:t>
-      </w:r>
-      <w:r>
-        <w:t xml:space="preserve"> </w:t>
-      </w:r>
-      <w:r>
-        <w:t xml:space="preserve">adoption de</w:t>
-      </w:r>
-      <w:r>
-        <w:t xml:space="preserve"> </w:t>
-      </w:r>
-      <w:r>
-        <w:rPr>
-          <w:b/>
-          <w:bCs/>
-        </w:rPr>
-        <w:t xml:space="preserve">Spring Boot 4.1.1</w:t>
-      </w:r>
-      <w:r>
-        <w:t xml:space="preserve">.</w:t>
-      </w:r>
-    </w:p>
-    <w:p>
-      <w:pPr>
-        <w:pStyle w:val="BodyText"/>
-      </w:pPr>
-      <w:r>
-        <w:rPr>
-          <w:b/>
-          <w:bCs/>
-        </w:rPr>
-        <w:t xml:space="preserve">Justifications :</w:t>
-      </w:r>
-    </w:p>
-    <w:p>
-      <w:pPr>
-        <w:pStyle w:val="Compact"/>
-        <w:numPr>
-          <w:ilvl w:val="0"/>
-          <w:numId w:val="1005"/>
-        </w:numPr>
-      </w:pPr>
-      <w:r>
-        <w:t xml:space="preserve">Version déjà opérationnelle dans le projet</w:t>
-      </w:r>
-    </w:p>
-    <w:p>
-      <w:pPr>
-        <w:pStyle w:val="Compact"/>
-        <w:numPr>
-          <w:ilvl w:val="0"/>
-          <w:numId w:val="1005"/>
-        </w:numPr>
-      </w:pPr>
-      <w:r>
-        <w:t xml:space="preserve">Support LTS jusqu’en 2031</w:t>
-      </w:r>
-    </w:p>
-    <w:p>
-      <w:pPr>
-        <w:pStyle w:val="Compact"/>
-        <w:numPr>
-          <w:ilvl w:val="0"/>
-          <w:numId w:val="1005"/>
-        </w:numPr>
-      </w:pPr>
-      <w:r>
-        <w:t xml:space="preserve">Compatibilité avec Spring Cloud 2026.0</w:t>
-      </w:r>
-    </w:p>
-    <w:p>
-      <w:pPr>
-        <w:pStyle w:val="Compact"/>
-        <w:numPr>
-          <w:ilvl w:val="0"/>
-          <w:numId w:val="1005"/>
-        </w:numPr>
-      </w:pPr>
-      <w:r>
-        <w:t xml:space="preserve">Support d’Hibernate 7 (multi-tenant natif — ADR-006)</w:t>
-      </w:r>
-    </w:p>
-    <w:bookmarkEnd w:id="24"/>
-    <w:bookmarkStart w:id="25" w:name="adr-009-choix-dangular-22-lts"/>
-    <w:p>
-      <w:pPr>
-        <w:pStyle w:val="Heading4"/>
-      </w:pPr>
-      <w:r>
-        <w:rPr>
-          <w:rStyle w:val="SectionNumber"/>
-        </w:rPr>
-        <w:t xml:space="preserve">1.3.4.2</w:t>
-      </w:r>
-      <w:r>
-        <w:tab/>
-      </w:r>
-      <w:r>
-        <w:t xml:space="preserve">3.2. ADR-009 — Choix d’Angular 22 LTS</w:t>
-      </w:r>
-    </w:p>
-    <w:p>
-      <w:pPr>
-        <w:pStyle w:val="FirstParagraph"/>
-      </w:pPr>
-      <w:r>
-        <w:rPr>
-          <w:b/>
-          <w:bCs/>
-        </w:rPr>
-        <w:t xml:space="preserve">Décision :</w:t>
-      </w:r>
-      <w:r>
-        <w:t xml:space="preserve"> </w:t>
-      </w:r>
-      <w:r>
-        <w:t xml:space="preserve">adoption d’</w:t>
-      </w:r>
-      <w:r>
-        <w:rPr>
-          <w:b/>
-          <w:bCs/>
-        </w:rPr>
-        <w:t xml:space="preserve">Angular 22.2.0 LTS</w:t>
-      </w:r>
-      <w:r>
-        <w:t xml:space="preserve">.</w:t>
-      </w:r>
-    </w:p>
-    <w:p>
-      <w:pPr>
-        <w:pStyle w:val="BodyText"/>
-      </w:pPr>
-      <w:r>
-        <w:rPr>
-          <w:b/>
-          <w:bCs/>
-        </w:rPr>
-        <w:t xml:space="preserve">Justifications :</w:t>
-      </w:r>
-    </w:p>
-    <w:p>
-      <w:pPr>
-        <w:pStyle w:val="Compact"/>
-        <w:numPr>
-          <w:ilvl w:val="0"/>
-          <w:numId w:val="1006"/>
-        </w:numPr>
-      </w:pPr>
-      <w:r>
-        <w:t xml:space="preserve">Version déjà opérationnelle (rapport 08-78)</w:t>
-      </w:r>
-    </w:p>
-    <w:p>
-      <w:pPr>
-        <w:pStyle w:val="Compact"/>
-        <w:numPr>
-          <w:ilvl w:val="0"/>
-          <w:numId w:val="1006"/>
-        </w:numPr>
-      </w:pPr>
-      <w:r>
-        <w:t xml:space="preserve">Support LTS jusqu’à fin 2027</w:t>
-      </w:r>
-    </w:p>
-    <w:p>
-      <w:pPr>
-        <w:pStyle w:val="Compact"/>
-        <w:numPr>
-          <w:ilvl w:val="0"/>
-          <w:numId w:val="1006"/>
-        </w:numPr>
-      </w:pPr>
-      <w:r>
-        <w:t xml:space="preserve">Signals + Standalone Components stables</w:t>
-      </w:r>
-    </w:p>
-    <w:p>
-      <w:pPr>
-        <w:pStyle w:val="Compact"/>
-        <w:numPr>
-          <w:ilvl w:val="0"/>
-          <w:numId w:val="1006"/>
-        </w:numPr>
-      </w:pPr>
-      <w:r>
-        <w:t xml:space="preserve">Compilateur Vite (performance accrue)</w:t>
-      </w:r>
-    </w:p>
-    <w:p>
-      <w:pPr>
-        <w:pStyle w:val="FirstParagraph"/>
-      </w:pPr>
-      <w:r>
-        <w:rPr>
-          <w:b/>
-          <w:bCs/>
-        </w:rPr>
-        <w:t xml:space="preserve">Durée effective :</w:t>
-      </w:r>
-      <w:r>
-        <w:t xml:space="preserve"> </w:t>
-      </w:r>
-      <w:r>
-        <w:t xml:space="preserve">1 heure.</w:t>
-      </w:r>
-    </w:p>
-    <w:p>
-      <w:r>
-        <w:pict>
-          <v:rect style="width:0;height:1.5pt" o:hralign="center" o:hrstd="t" o:hr="t"/>
-        </w:pict>
-      </w:r>
-    </w:p>
-    <w:bookmarkEnd w:id="25"/>
-    <w:bookmarkEnd w:id="26"/>
-    <w:bookmarkStart w:id="50" w:name="tâche-4-intégration-flyway-bloc-3-bl-004"/>
-    <w:p>
-      <w:pPr>
-        <w:pStyle w:val="Heading3"/>
-      </w:pPr>
-      <w:r>
-        <w:rPr>
-          <w:rStyle w:val="SectionNumber"/>
-        </w:rPr>
-        <w:t xml:space="preserve">1.3.5</w:t>
-      </w:r>
-      <w:r>
-        <w:tab/>
-      </w:r>
-      <w:r>
-        <w:t xml:space="preserve">Tâche 4 — Intégration Flyway (BLOC 3 — BL-004)</w:t>
-      </w:r>
-    </w:p>
-    <w:p>
-      <w:pPr>
-        <w:pStyle w:val="FirstParagraph"/>
-      </w:pPr>
-      <w:r>
-        <w:rPr>
-          <w:b/>
-          <w:bCs/>
-        </w:rPr>
-        <w:t xml:space="preserve">Objectif :</w:t>
-      </w:r>
-      <w:r>
-        <w:t xml:space="preserve"> </w:t>
-      </w:r>
-      <w:r>
-        <w:t xml:space="preserve">faire piloter le schéma Control Plane par Flyway.</w:t>
-      </w:r>
-    </w:p>
-    <w:bookmarkStart w:id="33" w:name="ajout-des-dépendances"/>
-    <w:p>
-      <w:pPr>
-        <w:pStyle w:val="Heading4"/>
-      </w:pPr>
-      <w:r>
-        <w:rPr>
-          <w:rStyle w:val="SectionNumber"/>
-        </w:rPr>
-        <w:t xml:space="preserve">1.3.5.1</w:t>
-      </w:r>
-      <w:r>
-        <w:tab/>
-      </w:r>
-      <w:r>
-        <w:t xml:space="preserve">4.1. Ajout des dépendances</w:t>
-      </w:r>
-    </w:p>
-    <w:p>
-      <w:pPr>
-        <w:pStyle w:val="FirstParagraph"/>
-      </w:pPr>
-      <w:r>
-        <w:t xml:space="preserve">Ajout de</w:t>
-      </w:r>
-      <w:r>
-        <w:t xml:space="preserve"> </w:t>
-      </w:r>
-      <w:r>
-        <w:rPr>
-          <w:rStyle w:val="VerbatimChar"/>
-        </w:rPr>
-        <w:t xml:space="preserve">flyway-core</w:t>
-      </w:r>
-      <w:r>
-        <w:t xml:space="preserve"> </w:t>
-      </w:r>
-      <w:r>
-        <w:t xml:space="preserve">et</w:t>
-      </w:r>
-      <w:r>
-        <w:t xml:space="preserve"> </w:t>
-      </w:r>
-      <w:r>
-        <w:rPr>
-          <w:rStyle w:val="VerbatimChar"/>
-        </w:rPr>
-        <w:t xml:space="preserve">flyway-database-postgresql</w:t>
-      </w:r>
-      <w:r>
-        <w:t xml:space="preserve"> </w:t>
-      </w:r>
-      <w:r>
-        <w:t xml:space="preserve">dans</w:t>
-      </w:r>
-      <w:r>
-        <w:t xml:space="preserve"> </w:t>
-      </w:r>
-      <w:r>
-        <w:rPr>
-          <w:rStyle w:val="VerbatimChar"/>
-        </w:rPr>
-        <w:t xml:space="preserve">pom.xml</w:t>
-      </w:r>
-      <w:r>
-        <w:t xml:space="preserve">.</w:t>
+        <w:t xml:space="preserve">Création de la sauvegarde horodatée db.backup-20260930-094319/.</w:t>
       </w:r>
     </w:p>
     <w:p>
@@ -2375,14 +1874,14 @@
       <w:r>
         <w:drawing>
           <wp:inline>
-            <wp:extent cx="5168766" cy="1280160"/>
+            <wp:extent cx="5334000" cy="2844800"/>
             <wp:effectExtent b="0" l="0" r="0" t="0"/>
-            <wp:docPr descr="Indentation TAB" title="" id="28" name="Picture"/>
+            <wp:docPr descr="Arborescence initiale : 6 fichiers SQL (V1-V3 CP + V1-V3 Tenant)." title="" id="28" name="Picture"/>
             <a:graphic>
               <a:graphicData uri="http://schemas.openxmlformats.org/drawingml/2006/picture">
                 <pic:pic>
                   <pic:nvPicPr>
-                    <pic:cNvPr descr="/home/idrissa_yameogo/projets/ycognicore-cloud/docs/rapports/captures/10/08-tab-detection.png" id="29" name="Picture"/>
+                    <pic:cNvPr descr="/home/idrissa_yameogo/projets/ycognicore-cloud/docs/rapports/captures/10/02-arborescence-initiale.png" id="29" name="Picture"/>
                     <pic:cNvPicPr>
                       <a:picLocks noChangeArrowheads="1" noChangeAspect="1"/>
                     </pic:cNvPicPr>
@@ -2396,7 +1895,7 @@
                   <pic:spPr bwMode="auto">
                     <a:xfrm>
                       <a:off x="0" y="0"/>
-                      <a:ext cx="5168766" cy="1280160"/>
+                      <a:ext cx="5334000" cy="2844800"/>
                     </a:xfrm>
                     <a:prstGeom prst="rect">
                       <a:avLst/>
@@ -2420,7 +1919,7 @@
         <w:pStyle w:val="ImageCaption"/>
       </w:pPr>
       <w:r>
-        <w:t xml:space="preserve">Indentation TAB</w:t>
+        <w:t xml:space="preserve">Arborescence initiale : 6 fichiers SQL (V1-V3 CP + V1-V3 Tenant).</w:t>
       </w:r>
     </w:p>
     <w:p>
@@ -2432,7 +1931,7 @@
           <w:i/>
           <w:iCs/>
         </w:rPr>
-        <w:t xml:space="preserve">Figure 4 — Diagnostic : indentation TAB détectée dans le pom.xml.</w:t>
+        <w:t xml:space="preserve">Arborescence initiale : 6 fichiers SQL (V1-V3 CP + V1-V3 Tenant).</w:t>
       </w:r>
     </w:p>
     <w:p>
@@ -2442,14 +1941,14 @@
       <w:r>
         <w:drawing>
           <wp:inline>
-            <wp:extent cx="5334000" cy="2947066"/>
+            <wp:extent cx="5334000" cy="1164311"/>
             <wp:effectExtent b="0" l="0" r="0" t="0"/>
-            <wp:docPr descr="Dépendances pom.xml" title="" id="31" name="Picture"/>
+            <wp:docPr descr="État des conteneurs Docker au démarrage de la journée." title="" id="31" name="Picture"/>
             <a:graphic>
               <a:graphicData uri="http://schemas.openxmlformats.org/drawingml/2006/picture">
                 <pic:pic>
                   <pic:nvPicPr>
-                    <pic:cNvPr descr="/home/idrissa_yameogo/projets/ycognicore-cloud/docs/rapports/captures/10/09-flyway-pom.png" id="32" name="Picture"/>
+                    <pic:cNvPr descr="/home/idrissa_yameogo/projets/ycognicore-cloud/docs/rapports/captures/10/01-docker-ps.png" id="32" name="Picture"/>
                     <pic:cNvPicPr>
                       <a:picLocks noChangeArrowheads="1" noChangeAspect="1"/>
                     </pic:cNvPicPr>
@@ -2463,7 +1962,7 @@
                   <pic:spPr bwMode="auto">
                     <a:xfrm>
                       <a:off x="0" y="0"/>
-                      <a:ext cx="5334000" cy="2947066"/>
+                      <a:ext cx="5334000" cy="1164311"/>
                     </a:xfrm>
                     <a:prstGeom prst="rect">
                       <a:avLst/>
@@ -2487,7 +1986,7 @@
         <w:pStyle w:val="ImageCaption"/>
       </w:pPr>
       <w:r>
-        <w:t xml:space="preserve">Dépendances pom.xml</w:t>
+        <w:t xml:space="preserve">État des conteneurs Docker au démarrage de la journée.</w:t>
       </w:r>
     </w:p>
     <w:p>
@@ -2499,26 +1998,25 @@
           <w:i/>
           <w:iCs/>
         </w:rPr>
-        <w:t xml:space="preserve">Figure 5 — Ajout des dépendances Flyway + vérification visuelle.</w:t>
-      </w:r>
-    </w:p>
-    <w:bookmarkEnd w:id="33"/>
-    <w:bookmarkStart w:id="37" w:name="validation-et-compilation"/>
-    <w:p>
-      <w:pPr>
-        <w:pStyle w:val="Heading4"/>
-      </w:pPr>
-      <w:r>
-        <w:rPr>
-          <w:rStyle w:val="SectionNumber"/>
-        </w:rPr>
-        <w:t xml:space="preserve">1.3.5.2</w:t>
-      </w:r>
-      <w:r>
-        <w:tab/>
-      </w:r>
-      <w:r>
-        <w:t xml:space="preserve">4.2. Validation et compilation</w:t>
+        <w:t xml:space="preserve">État des conteneurs Docker au démarrage de la journée.</w:t>
+      </w:r>
+    </w:p>
+    <w:p>
+      <w:pPr>
+        <w:pStyle w:val="BodyText"/>
+      </w:pPr>
+      <w:r>
+        <w:rPr>
+          <w:b/>
+          <w:bCs/>
+        </w:rPr>
+        <w:t xml:space="preserve">Durée effective :</w:t>
+      </w:r>
+      <w:r>
+        <w:t xml:space="preserve"> </w:t>
+      </w:r>
+      <w:r>
+        <w:t xml:space="preserve">30 minutes.</w:t>
       </w:r>
     </w:p>
     <w:p>
@@ -2528,20 +2026,20 @@
       <w:r>
         <w:drawing>
           <wp:inline>
-            <wp:extent cx="5334000" cy="2026919"/>
+            <wp:extent cx="5334000" cy="2400300"/>
             <wp:effectExtent b="0" l="0" r="0" t="0"/>
-            <wp:docPr descr="Validation OK" title="" id="35" name="Picture"/>
+            <wp:docPr descr="État final Git : historique des commits et tags de la journée." title="" id="34" name="Picture"/>
             <a:graphic>
               <a:graphicData uri="http://schemas.openxmlformats.org/drawingml/2006/picture">
                 <pic:pic>
                   <pic:nvPicPr>
-                    <pic:cNvPr descr="/home/idrissa_yameogo/projets/ycognicore-cloud/docs/rapports/captures/10/10-validation-compilation.png" id="36" name="Picture"/>
+                    <pic:cNvPr descr="/home/idrissa_yameogo/projets/ycognicore-cloud/docs/rapports/captures/10/51-etat-final-git.png" id="35" name="Picture"/>
                     <pic:cNvPicPr>
                       <a:picLocks noChangeArrowheads="1" noChangeAspect="1"/>
                     </pic:cNvPicPr>
                   </pic:nvPicPr>
                   <pic:blipFill>
-                    <a:blip r:embed="rId34"/>
+                    <a:blip r:embed="rId33"/>
                     <a:stretch>
                       <a:fillRect/>
                     </a:stretch>
@@ -2549,7 +2047,7 @@
                   <pic:spPr bwMode="auto">
                     <a:xfrm>
                       <a:off x="0" y="0"/>
-                      <a:ext cx="5334000" cy="2026919"/>
+                      <a:ext cx="5334000" cy="2400300"/>
                     </a:xfrm>
                     <a:prstGeom prst="rect">
                       <a:avLst/>
@@ -2573,7 +2071,7 @@
         <w:pStyle w:val="ImageCaption"/>
       </w:pPr>
       <w:r>
-        <w:t xml:space="preserve">Validation OK</w:t>
+        <w:t xml:space="preserve">État final Git : historique des commits et tags de la journée.</w:t>
       </w:r>
     </w:p>
     <w:p>
@@ -2585,26 +2083,7 @@
           <w:i/>
           <w:iCs/>
         </w:rPr>
-        <w:t xml:space="preserve">Figure 6 — XML valide + compilation OK.</w:t>
-      </w:r>
-    </w:p>
-    <w:bookmarkEnd w:id="37"/>
-    <w:bookmarkStart w:id="41" w:name="configuration-application.yml"/>
-    <w:p>
-      <w:pPr>
-        <w:pStyle w:val="Heading4"/>
-      </w:pPr>
-      <w:r>
-        <w:rPr>
-          <w:rStyle w:val="SectionNumber"/>
-        </w:rPr>
-        <w:t xml:space="preserve">1.3.5.3</w:t>
-      </w:r>
-      <w:r>
-        <w:tab/>
-      </w:r>
-      <w:r>
-        <w:t xml:space="preserve">4.3. Configuration application.yml</w:t>
+        <w:t xml:space="preserve">État final Git : historique des commits et tags de la journée.</w:t>
       </w:r>
     </w:p>
     <w:p>
@@ -2614,20 +2093,20 @@
       <w:r>
         <w:drawing>
           <wp:inline>
-            <wp:extent cx="5334000" cy="2395294"/>
+            <wp:extent cx="5334000" cy="2311400"/>
             <wp:effectExtent b="0" l="0" r="0" t="0"/>
-            <wp:docPr descr="application.yml" title="" id="39" name="Picture"/>
+            <wp:docPr descr="Commit BL-004 : intégration Flyway + ADRs 008/009/010." title="" id="37" name="Picture"/>
             <a:graphic>
               <a:graphicData uri="http://schemas.openxmlformats.org/drawingml/2006/picture">
                 <pic:pic>
                   <pic:nvPicPr>
-                    <pic:cNvPr descr="/home/idrissa_yameogo/projets/ycognicore-cloud/docs/rapports/captures/10/11-application-yml.png" id="40" name="Picture"/>
+                    <pic:cNvPr descr="/home/idrissa_yameogo/projets/ycognicore-cloud/docs/rapports/captures/10/49-commit-bl004.png" id="38" name="Picture"/>
                     <pic:cNvPicPr>
                       <a:picLocks noChangeArrowheads="1" noChangeAspect="1"/>
                     </pic:cNvPicPr>
                   </pic:nvPicPr>
                   <pic:blipFill>
-                    <a:blip r:embed="rId38"/>
+                    <a:blip r:embed="rId36"/>
                     <a:stretch>
                       <a:fillRect/>
                     </a:stretch>
@@ -2635,7 +2114,7 @@
                   <pic:spPr bwMode="auto">
                     <a:xfrm>
                       <a:off x="0" y="0"/>
-                      <a:ext cx="5334000" cy="2395294"/>
+                      <a:ext cx="5334000" cy="2311400"/>
                     </a:xfrm>
                     <a:prstGeom prst="rect">
                       <a:avLst/>
@@ -2659,7 +2138,7 @@
         <w:pStyle w:val="ImageCaption"/>
       </w:pPr>
       <w:r>
-        <w:t xml:space="preserve">application.yml</w:t>
+        <w:t xml:space="preserve">Commit BL-004 : intégration Flyway + ADRs 008/009/010.</w:t>
       </w:r>
     </w:p>
     <w:p>
@@ -2671,26 +2150,192 @@
           <w:i/>
           <w:iCs/>
         </w:rPr>
-        <w:t xml:space="preserve">Figure 7 — application.yml créé (49 lignes).</w:t>
-      </w:r>
-    </w:p>
-    <w:bookmarkEnd w:id="41"/>
-    <w:bookmarkStart w:id="45" w:name="X95d9e40fc665da7fd7856f0428a762436f5d3db"/>
-    <w:p>
-      <w:pPr>
-        <w:pStyle w:val="Heading4"/>
+        <w:t xml:space="preserve">Commit BL-004 : intégration Flyway + ADRs 008/009/010.</w:t>
+      </w:r>
+    </w:p>
+    <w:p>
+      <w:r>
+        <w:pict>
+          <v:rect style="width:0;height:1.5pt" o:hralign="center" o:hrstd="t" o:hr="t"/>
+        </w:pict>
+      </w:r>
+    </w:p>
+    <w:bookmarkEnd w:id="39"/>
+    <w:bookmarkStart w:id="45" w:name="Xeaa754c95fae8af11526b220e4a3b82cfe7b57a"/>
+    <w:p>
+      <w:pPr>
+        <w:pStyle w:val="Heading3"/>
       </w:pPr>
       <w:r>
         <w:rPr>
           <w:rStyle w:val="SectionNumber"/>
         </w:rPr>
-        <w:t xml:space="preserve">1.3.5.4</w:t>
+        <w:t xml:space="preserve">3.3</w:t>
       </w:r>
       <w:r>
         <w:tab/>
       </w:r>
       <w:r>
-        <w:t xml:space="preserve">4.4. Problème : Spring Boot 4 sans starter Flyway</w:t>
+        <w:t xml:space="preserve">Tâche 2 — Reconstruction des 13 migrations SQL (BLOC 1)</w:t>
+      </w:r>
+    </w:p>
+    <w:p>
+      <w:pPr>
+        <w:pStyle w:val="FirstParagraph"/>
+      </w:pPr>
+      <w:r>
+        <w:rPr>
+          <w:b/>
+          <w:bCs/>
+        </w:rPr>
+        <w:t xml:space="preserve">Objectif :</w:t>
+      </w:r>
+      <w:r>
+        <w:t xml:space="preserve"> </w:t>
+      </w:r>
+      <w:r>
+        <w:t xml:space="preserve">reconstruire proprement les 13 migrations SQL selon l’Approche A.</w:t>
+      </w:r>
+    </w:p>
+    <w:p>
+      <w:pPr>
+        <w:pStyle w:val="BodyText"/>
+      </w:pPr>
+      <w:r>
+        <w:rPr>
+          <w:b/>
+          <w:bCs/>
+        </w:rPr>
+        <w:t xml:space="preserve">Déroulement :</w:t>
+      </w:r>
+    </w:p>
+    <w:p>
+      <w:pPr>
+        <w:numPr>
+          <w:ilvl w:val="0"/>
+          <w:numId w:val="1004"/>
+        </w:numPr>
+      </w:pPr>
+      <w:r>
+        <w:rPr>
+          <w:b/>
+          <w:bCs/>
+        </w:rPr>
+        <w:t xml:space="preserve">Control Plane (6 migrations)</w:t>
+      </w:r>
+      <w:r>
+        <w:t xml:space="preserve"> </w:t>
+      </w:r>
+      <w:r>
+        <w:t xml:space="preserve">: V1 à V6 (socle, abonnements, quotas IA, transversales, sécurité Superadmin, enrichissements).</w:t>
+      </w:r>
+    </w:p>
+    <w:p>
+      <w:pPr>
+        <w:numPr>
+          <w:ilvl w:val="0"/>
+          <w:numId w:val="1004"/>
+        </w:numPr>
+      </w:pPr>
+      <w:r>
+        <w:rPr>
+          <w:b/>
+          <w:bCs/>
+        </w:rPr>
+        <w:t xml:space="preserve">Tenant (7 migrations)</w:t>
+      </w:r>
+      <w:r>
+        <w:t xml:space="preserve"> </w:t>
+      </w:r>
+      <w:r>
+        <w:t xml:space="preserve">: V1 à V7 (socle RBAC, password history, login attempts, extensions, enrichissements, verrouillage).</w:t>
+      </w:r>
+    </w:p>
+    <w:p>
+      <w:pPr>
+        <w:numPr>
+          <w:ilvl w:val="0"/>
+          <w:numId w:val="1004"/>
+        </w:numPr>
+      </w:pPr>
+      <w:r>
+        <w:rPr>
+          <w:b/>
+          <w:bCs/>
+        </w:rPr>
+        <w:t xml:space="preserve">Vérification par fichier</w:t>
+      </w:r>
+      <w:r>
+        <w:t xml:space="preserve"> </w:t>
+      </w:r>
+      <w:r>
+        <w:t xml:space="preserve">: comptage des</w:t>
+      </w:r>
+      <w:r>
+        <w:t xml:space="preserve"> </w:t>
+      </w:r>
+      <w:r>
+        <w:rPr>
+          <w:rStyle w:val="VerbatimChar"/>
+        </w:rPr>
+        <w:t xml:space="preserve">CREATE TABLE</w:t>
+      </w:r>
+      <w:r>
+        <w:t xml:space="preserve">,</w:t>
+      </w:r>
+      <w:r>
+        <w:t xml:space="preserve"> </w:t>
+      </w:r>
+      <w:r>
+        <w:rPr>
+          <w:rStyle w:val="VerbatimChar"/>
+        </w:rPr>
+        <w:t xml:space="preserve">CREATE FUNCTION</w:t>
+      </w:r>
+      <w:r>
+        <w:t xml:space="preserve">,</w:t>
+      </w:r>
+      <w:r>
+        <w:t xml:space="preserve"> </w:t>
+      </w:r>
+      <w:r>
+        <w:rPr>
+          <w:rStyle w:val="VerbatimChar"/>
+        </w:rPr>
+        <w:t xml:space="preserve">CREATE TRIGGER</w:t>
+      </w:r>
+      <w:r>
+        <w:t xml:space="preserve">,</w:t>
+      </w:r>
+      <w:r>
+        <w:t xml:space="preserve"> </w:t>
+      </w:r>
+      <w:r>
+        <w:rPr>
+          <w:rStyle w:val="VerbatimChar"/>
+        </w:rPr>
+        <w:t xml:space="preserve">CREATE INDEX</w:t>
+      </w:r>
+      <w:r>
+        <w:t xml:space="preserve">.</w:t>
+      </w:r>
+    </w:p>
+    <w:p>
+      <w:pPr>
+        <w:pStyle w:val="FirstParagraph"/>
+      </w:pPr>
+      <w:r>
+        <w:rPr>
+          <w:b/>
+          <w:bCs/>
+        </w:rPr>
+        <w:t xml:space="preserve">Résultat :</w:t>
+      </w:r>
+      <w:r>
+        <w:t xml:space="preserve"> </w:t>
+      </w:r>
+      <w:r>
+        <w:t xml:space="preserve">13 fichiers SQL (6 CP + 7 Tenant) + 1 vérificateur.</w:t>
       </w:r>
     </w:p>
     <w:p>
@@ -2700,20 +2345,20 @@
       <w:r>
         <w:drawing>
           <wp:inline>
-            <wp:extent cx="5334000" cy="1087243"/>
+            <wp:extent cx="5334000" cy="1454198"/>
             <wp:effectExtent b="0" l="0" r="0" t="0"/>
-            <wp:docPr descr="Starters Boot 4" title="" id="43" name="Picture"/>
+            <wp:docPr descr="Compteurs par migration (CREATE TABLE, FUNCTION, TRIGGER, lignes)." title="" id="41" name="Picture"/>
             <a:graphic>
               <a:graphicData uri="http://schemas.openxmlformats.org/drawingml/2006/picture">
                 <pic:pic>
                   <pic:nvPicPr>
-                    <pic:cNvPr descr="/home/idrissa_yameogo/projets/ycognicore-cloud/docs/rapports/captures/10/16-boot4-starters.png" id="44" name="Picture"/>
+                    <pic:cNvPr descr="/home/idrissa_yameogo/projets/ycognicore-cloud/docs/rapports/captures/10/05-recap-migrations.png" id="42" name="Picture"/>
                     <pic:cNvPicPr>
                       <a:picLocks noChangeArrowheads="1" noChangeAspect="1"/>
                     </pic:cNvPicPr>
                   </pic:nvPicPr>
                   <pic:blipFill>
-                    <a:blip r:embed="rId42"/>
+                    <a:blip r:embed="rId40"/>
                     <a:stretch>
                       <a:fillRect/>
                     </a:stretch>
@@ -2721,7 +2366,7 @@
                   <pic:spPr bwMode="auto">
                     <a:xfrm>
                       <a:off x="0" y="0"/>
-                      <a:ext cx="5334000" cy="1087243"/>
+                      <a:ext cx="5334000" cy="1454198"/>
                     </a:xfrm>
                     <a:prstGeom prst="rect">
                       <a:avLst/>
@@ -2745,7 +2390,7 @@
         <w:pStyle w:val="ImageCaption"/>
       </w:pPr>
       <w:r>
-        <w:t xml:space="preserve">Starters Boot 4</w:t>
+        <w:t xml:space="preserve">Compteurs par migration (CREATE TABLE, FUNCTION, TRIGGER, lignes).</w:t>
       </w:r>
     </w:p>
     <w:p>
@@ -2757,26 +2402,7 @@
           <w:i/>
           <w:iCs/>
         </w:rPr>
-        <w:t xml:space="preserve">Figure 8 — Diagnostic : aucun starter Flyway n’existe pour Boot 4.</w:t>
-      </w:r>
-    </w:p>
-    <w:bookmarkEnd w:id="45"/>
-    <w:bookmarkStart w:id="49" w:name="résultat-6-puis-7-migrations-appliquées"/>
-    <w:p>
-      <w:pPr>
-        <w:pStyle w:val="Heading4"/>
-      </w:pPr>
-      <w:r>
-        <w:rPr>
-          <w:rStyle w:val="SectionNumber"/>
-        </w:rPr>
-        <w:t xml:space="preserve">1.3.5.5</w:t>
-      </w:r>
-      <w:r>
-        <w:tab/>
-      </w:r>
-      <w:r>
-        <w:t xml:space="preserve">4.5. Résultat — 6 puis 7 migrations appliquées</w:t>
+        <w:t xml:space="preserve">Compteurs par migration (CREATE TABLE, FUNCTION, TRIGGER, lignes).</w:t>
       </w:r>
     </w:p>
     <w:p>
@@ -2786,20 +2412,20 @@
       <w:r>
         <w:drawing>
           <wp:inline>
-            <wp:extent cx="5334000" cy="1662625"/>
+            <wp:extent cx="5334000" cy="1740568"/>
             <wp:effectExtent b="0" l="0" r="0" t="0"/>
-            <wp:docPr descr="Flyway history" title="" id="47" name="Picture"/>
+            <wp:docPr descr="13 migrations finales" title="" id="43" name="Picture"/>
             <a:graphic>
               <a:graphicData uri="http://schemas.openxmlformats.org/drawingml/2006/picture">
                 <pic:pic>
                   <pic:nvPicPr>
-                    <pic:cNvPr descr="/home/idrissa_yameogo/projets/ycognicore-cloud/docs/rapports/captures/10/19-flyway-history.png" id="48" name="Picture"/>
+                    <pic:cNvPr descr="/home/idrissa_yameogo/projets/ycognicore-cloud/docs/rapports/captures/10/04-13-migrations.png" id="44" name="Picture"/>
                     <pic:cNvPicPr>
                       <a:picLocks noChangeArrowheads="1" noChangeAspect="1"/>
                     </pic:cNvPicPr>
                   </pic:nvPicPr>
                   <pic:blipFill>
-                    <a:blip r:embed="rId46"/>
+                    <a:blip r:embed="rId19"/>
                     <a:stretch>
                       <a:fillRect/>
                     </a:stretch>
@@ -2807,7 +2433,7 @@
                   <pic:spPr bwMode="auto">
                     <a:xfrm>
                       <a:off x="0" y="0"/>
-                      <a:ext cx="5334000" cy="1662625"/>
+                      <a:ext cx="5334000" cy="1740568"/>
                     </a:xfrm>
                     <a:prstGeom prst="rect">
                       <a:avLst/>
@@ -2831,7 +2457,7 @@
         <w:pStyle w:val="ImageCaption"/>
       </w:pPr>
       <w:r>
-        <w:t xml:space="preserve">Flyway history</w:t>
+        <w:t xml:space="preserve">13 migrations finales</w:t>
       </w:r>
     </w:p>
     <w:p>
@@ -2843,7 +2469,7 @@
           <w:i/>
           <w:iCs/>
         </w:rPr>
-        <w:t xml:space="preserve">Figure 9 — flyway_schema_history : 7 migrations (V1 à V7).</w:t>
+        <w:t xml:space="preserve">Figure 3 — Vérification finale : 6 migrations CP + 7 Tenant = 13.</w:t>
       </w:r>
     </w:p>
     <w:p>
@@ -2861,7 +2487,7 @@
         <w:t xml:space="preserve"> </w:t>
       </w:r>
       <w:r>
-        <w:t xml:space="preserve">1 heure.</w:t>
+        <w:t xml:space="preserve">1 heure 30.</w:t>
       </w:r>
     </w:p>
     <w:p>
@@ -2871,9 +2497,8 @@
         </w:pict>
       </w:r>
     </w:p>
-    <w:bookmarkEnd w:id="49"/>
-    <w:bookmarkEnd w:id="50"/>
-    <w:bookmarkStart w:id="67" w:name="X9413cbdb2b853f865b13181a204bdc1cb34990b"/>
+    <w:bookmarkEnd w:id="45"/>
+    <w:bookmarkStart w:id="48" w:name="tâche-3-décisions-technologiques-bloc-2"/>
     <w:p>
       <w:pPr>
         <w:pStyle w:val="Heading3"/>
@@ -2882,13 +2507,31 @@
         <w:rPr>
           <w:rStyle w:val="SectionNumber"/>
         </w:rPr>
-        <w:t xml:space="preserve">1.3.6</w:t>
+        <w:t xml:space="preserve">3.4</w:t>
       </w:r>
       <w:r>
         <w:tab/>
       </w:r>
       <w:r>
-        <w:t xml:space="preserve">Tâche 5 — Maintenance automatique des partitions (BLOC 4 — BL-005)</w:t>
+        <w:t xml:space="preserve">Tâche 3 — Décisions technologiques (BLOC 2)</w:t>
+      </w:r>
+    </w:p>
+    <w:bookmarkStart w:id="46" w:name="adr-008-choix-de-spring-boot-4"/>
+    <w:p>
+      <w:pPr>
+        <w:pStyle w:val="Heading4"/>
+      </w:pPr>
+      <w:r>
+        <w:rPr>
+          <w:rStyle w:val="SectionNumber"/>
+        </w:rPr>
+        <w:t xml:space="preserve">3.4.1</w:t>
+      </w:r>
+      <w:r>
+        <w:tab/>
+      </w:r>
+      <w:r>
+        <w:t xml:space="preserve">3.1. ADR-008 — Choix de Spring Boot 4</w:t>
       </w:r>
     </w:p>
     <w:p>
@@ -2900,16 +2543,259 @@
           <w:b/>
           <w:bCs/>
         </w:rPr>
+        <w:t xml:space="preserve">Décision :</w:t>
+      </w:r>
+      <w:r>
+        <w:t xml:space="preserve"> </w:t>
+      </w:r>
+      <w:r>
+        <w:t xml:space="preserve">adoption de</w:t>
+      </w:r>
+      <w:r>
+        <w:t xml:space="preserve"> </w:t>
+      </w:r>
+      <w:r>
+        <w:rPr>
+          <w:b/>
+          <w:bCs/>
+        </w:rPr>
+        <w:t xml:space="preserve">Spring Boot 4.1.1</w:t>
+      </w:r>
+      <w:r>
+        <w:t xml:space="preserve">.</w:t>
+      </w:r>
+    </w:p>
+    <w:p>
+      <w:pPr>
+        <w:pStyle w:val="BodyText"/>
+      </w:pPr>
+      <w:r>
+        <w:rPr>
+          <w:b/>
+          <w:bCs/>
+        </w:rPr>
+        <w:t xml:space="preserve">Justifications :</w:t>
+      </w:r>
+    </w:p>
+    <w:p>
+      <w:pPr>
+        <w:pStyle w:val="Compact"/>
+        <w:numPr>
+          <w:ilvl w:val="0"/>
+          <w:numId w:val="1005"/>
+        </w:numPr>
+      </w:pPr>
+      <w:r>
+        <w:t xml:space="preserve">Version déjà opérationnelle dans le projet</w:t>
+      </w:r>
+    </w:p>
+    <w:p>
+      <w:pPr>
+        <w:pStyle w:val="Compact"/>
+        <w:numPr>
+          <w:ilvl w:val="0"/>
+          <w:numId w:val="1005"/>
+        </w:numPr>
+      </w:pPr>
+      <w:r>
+        <w:t xml:space="preserve">Support LTS jusqu’en 2031</w:t>
+      </w:r>
+    </w:p>
+    <w:p>
+      <w:pPr>
+        <w:pStyle w:val="Compact"/>
+        <w:numPr>
+          <w:ilvl w:val="0"/>
+          <w:numId w:val="1005"/>
+        </w:numPr>
+      </w:pPr>
+      <w:r>
+        <w:t xml:space="preserve">Compatibilité avec Spring Cloud 2026.0</w:t>
+      </w:r>
+    </w:p>
+    <w:p>
+      <w:pPr>
+        <w:pStyle w:val="Compact"/>
+        <w:numPr>
+          <w:ilvl w:val="0"/>
+          <w:numId w:val="1005"/>
+        </w:numPr>
+      </w:pPr>
+      <w:r>
+        <w:t xml:space="preserve">Support d’Hibernate 7 (multi-tenant natif — ADR-006)</w:t>
+      </w:r>
+    </w:p>
+    <w:bookmarkEnd w:id="46"/>
+    <w:bookmarkStart w:id="47" w:name="adr-009-choix-dangular-22-lts"/>
+    <w:p>
+      <w:pPr>
+        <w:pStyle w:val="Heading4"/>
+      </w:pPr>
+      <w:r>
+        <w:rPr>
+          <w:rStyle w:val="SectionNumber"/>
+        </w:rPr>
+        <w:t xml:space="preserve">3.4.2</w:t>
+      </w:r>
+      <w:r>
+        <w:tab/>
+      </w:r>
+      <w:r>
+        <w:t xml:space="preserve">3.2. ADR-009 — Choix d’Angular 22 LTS</w:t>
+      </w:r>
+    </w:p>
+    <w:p>
+      <w:pPr>
+        <w:pStyle w:val="FirstParagraph"/>
+      </w:pPr>
+      <w:r>
+        <w:rPr>
+          <w:b/>
+          <w:bCs/>
+        </w:rPr>
+        <w:t xml:space="preserve">Décision :</w:t>
+      </w:r>
+      <w:r>
+        <w:t xml:space="preserve"> </w:t>
+      </w:r>
+      <w:r>
+        <w:t xml:space="preserve">adoption d’</w:t>
+      </w:r>
+      <w:r>
+        <w:rPr>
+          <w:b/>
+          <w:bCs/>
+        </w:rPr>
+        <w:t xml:space="preserve">Angular 22.2.0 LTS</w:t>
+      </w:r>
+      <w:r>
+        <w:t xml:space="preserve">.</w:t>
+      </w:r>
+    </w:p>
+    <w:p>
+      <w:pPr>
+        <w:pStyle w:val="BodyText"/>
+      </w:pPr>
+      <w:r>
+        <w:rPr>
+          <w:b/>
+          <w:bCs/>
+        </w:rPr>
+        <w:t xml:space="preserve">Justifications :</w:t>
+      </w:r>
+    </w:p>
+    <w:p>
+      <w:pPr>
+        <w:pStyle w:val="Compact"/>
+        <w:numPr>
+          <w:ilvl w:val="0"/>
+          <w:numId w:val="1006"/>
+        </w:numPr>
+      </w:pPr>
+      <w:r>
+        <w:t xml:space="preserve">Version déjà opérationnelle (rapport 08-78)</w:t>
+      </w:r>
+    </w:p>
+    <w:p>
+      <w:pPr>
+        <w:pStyle w:val="Compact"/>
+        <w:numPr>
+          <w:ilvl w:val="0"/>
+          <w:numId w:val="1006"/>
+        </w:numPr>
+      </w:pPr>
+      <w:r>
+        <w:t xml:space="preserve">Support LTS jusqu’à fin 2027</w:t>
+      </w:r>
+    </w:p>
+    <w:p>
+      <w:pPr>
+        <w:pStyle w:val="Compact"/>
+        <w:numPr>
+          <w:ilvl w:val="0"/>
+          <w:numId w:val="1006"/>
+        </w:numPr>
+      </w:pPr>
+      <w:r>
+        <w:t xml:space="preserve">Signals + Standalone Components stables</w:t>
+      </w:r>
+    </w:p>
+    <w:p>
+      <w:pPr>
+        <w:pStyle w:val="Compact"/>
+        <w:numPr>
+          <w:ilvl w:val="0"/>
+          <w:numId w:val="1006"/>
+        </w:numPr>
+      </w:pPr>
+      <w:r>
+        <w:t xml:space="preserve">Compilateur Vite (performance accrue)</w:t>
+      </w:r>
+    </w:p>
+    <w:p>
+      <w:pPr>
+        <w:pStyle w:val="FirstParagraph"/>
+      </w:pPr>
+      <w:r>
+        <w:rPr>
+          <w:b/>
+          <w:bCs/>
+        </w:rPr>
+        <w:t xml:space="preserve">Durée effective :</w:t>
+      </w:r>
+      <w:r>
+        <w:t xml:space="preserve"> </w:t>
+      </w:r>
+      <w:r>
+        <w:t xml:space="preserve">1 heure.</w:t>
+      </w:r>
+    </w:p>
+    <w:p>
+      <w:r>
+        <w:pict>
+          <v:rect style="width:0;height:1.5pt" o:hralign="center" o:hrstd="t" o:hr="t"/>
+        </w:pict>
+      </w:r>
+    </w:p>
+    <w:bookmarkEnd w:id="47"/>
+    <w:bookmarkEnd w:id="48"/>
+    <w:bookmarkStart w:id="72" w:name="tâche-4-intégration-flyway-bloc-3-bl-004"/>
+    <w:p>
+      <w:pPr>
+        <w:pStyle w:val="Heading3"/>
+      </w:pPr>
+      <w:r>
+        <w:rPr>
+          <w:rStyle w:val="SectionNumber"/>
+        </w:rPr>
+        <w:t xml:space="preserve">3.5</w:t>
+      </w:r>
+      <w:r>
+        <w:tab/>
+      </w:r>
+      <w:r>
+        <w:t xml:space="preserve">Tâche 4 — Intégration Flyway (BLOC 3 — BL-004)</w:t>
+      </w:r>
+    </w:p>
+    <w:p>
+      <w:pPr>
+        <w:pStyle w:val="FirstParagraph"/>
+      </w:pPr>
+      <w:r>
+        <w:rPr>
+          <w:b/>
+          <w:bCs/>
+        </w:rPr>
         <w:t xml:space="preserve">Objectif :</w:t>
       </w:r>
       <w:r>
         <w:t xml:space="preserve"> </w:t>
       </w:r>
       <w:r>
-        <w:t xml:space="preserve">automatiser la création des partitions mensuelles.</w:t>
-      </w:r>
-    </w:p>
-    <w:bookmarkStart w:id="54" w:name="création-de-la-migration-v7"/>
+        <w:t xml:space="preserve">faire piloter le schéma Control Plane par Flyway.</w:t>
+      </w:r>
+    </w:p>
+    <w:bookmarkStart w:id="55" w:name="ajout-des-dépendances"/>
     <w:p>
       <w:pPr>
         <w:pStyle w:val="Heading4"/>
@@ -2918,13 +2804,13 @@
         <w:rPr>
           <w:rStyle w:val="SectionNumber"/>
         </w:rPr>
-        <w:t xml:space="preserve">1.3.6.1</w:t>
+        <w:t xml:space="preserve">3.5.1</w:t>
       </w:r>
       <w:r>
         <w:tab/>
       </w:r>
       <w:r>
-        <w:t xml:space="preserve">5.1. Création de la migration V7</w:t>
+        <w:t xml:space="preserve">4.1. Ajout des dépendances</w:t>
       </w:r>
     </w:p>
     <w:p>
@@ -2932,7 +2818,7 @@
         <w:pStyle w:val="FirstParagraph"/>
       </w:pPr>
       <w:r>
-        <w:t xml:space="preserve">Table</w:t>
+        <w:t xml:space="preserve">Ajout de</w:t>
       </w:r>
       <w:r>
         <w:t xml:space="preserve"> </w:t>
@@ -2941,13 +2827,40 @@
         <w:rPr>
           <w:rStyle w:val="VerbatimChar"/>
         </w:rPr>
-        <w:t xml:space="preserve">partition_maintenance_log</w:t>
-      </w:r>
-      <w:r>
-        <w:t xml:space="preserve"> </w:t>
-      </w:r>
-      <w:r>
-        <w:t xml:space="preserve">avec traçabilité complète.</w:t>
+        <w:t xml:space="preserve">flyway-core</w:t>
+      </w:r>
+      <w:r>
+        <w:t xml:space="preserve"> </w:t>
+      </w:r>
+      <w:r>
+        <w:t xml:space="preserve">et</w:t>
+      </w:r>
+      <w:r>
+        <w:t xml:space="preserve"> </w:t>
+      </w:r>
+      <w:r>
+        <w:rPr>
+          <w:rStyle w:val="VerbatimChar"/>
+        </w:rPr>
+        <w:t xml:space="preserve">flyway-database-postgresql</w:t>
+      </w:r>
+      <w:r>
+        <w:t xml:space="preserve"> </w:t>
+      </w:r>
+      <w:r>
+        <w:t xml:space="preserve">dans</w:t>
+      </w:r>
+      <w:r>
+        <w:t xml:space="preserve"> </w:t>
+      </w:r>
+      <w:r>
+        <w:rPr>
+          <w:rStyle w:val="VerbatimChar"/>
+        </w:rPr>
+        <w:t xml:space="preserve">pom.xml</w:t>
+      </w:r>
+      <w:r>
+        <w:t xml:space="preserve">.</w:t>
       </w:r>
     </w:p>
     <w:p>
@@ -2957,20 +2870,20 @@
       <w:r>
         <w:drawing>
           <wp:inline>
-            <wp:extent cx="5334000" cy="3098708"/>
+            <wp:extent cx="5334000" cy="1333500"/>
             <wp:effectExtent b="0" l="0" r="0" t="0"/>
-            <wp:docPr descr="V7 créé" title="" id="52" name="Picture"/>
+            <wp:docPr descr="Indentation TAB" title="" id="50" name="Picture"/>
             <a:graphic>
               <a:graphicData uri="http://schemas.openxmlformats.org/drawingml/2006/picture">
                 <pic:pic>
                   <pic:nvPicPr>
-                    <pic:cNvPr descr="/home/idrissa_yameogo/projets/ycognicore-cloud/docs/rapports/captures/10/23-v7-created.png" id="53" name="Picture"/>
+                    <pic:cNvPr descr="/home/idrissa_yameogo/projets/ycognicore-cloud/docs/rapports/captures/10/08-tab-detection.png" id="51" name="Picture"/>
                     <pic:cNvPicPr>
                       <a:picLocks noChangeArrowheads="1" noChangeAspect="1"/>
                     </pic:cNvPicPr>
                   </pic:nvPicPr>
                   <pic:blipFill>
-                    <a:blip r:embed="rId51"/>
+                    <a:blip r:embed="rId49"/>
                     <a:stretch>
                       <a:fillRect/>
                     </a:stretch>
@@ -2978,7 +2891,7 @@
                   <pic:spPr bwMode="auto">
                     <a:xfrm>
                       <a:off x="0" y="0"/>
-                      <a:ext cx="5334000" cy="3098708"/>
+                      <a:ext cx="5334000" cy="1333500"/>
                     </a:xfrm>
                     <a:prstGeom prst="rect">
                       <a:avLst/>
@@ -3002,7 +2915,7 @@
         <w:pStyle w:val="ImageCaption"/>
       </w:pPr>
       <w:r>
-        <w:t xml:space="preserve">V7 créé</w:t>
+        <w:t xml:space="preserve">Indentation TAB</w:t>
       </w:r>
     </w:p>
     <w:p>
@@ -3010,26 +2923,11 @@
         <w:pStyle w:val="BodyText"/>
       </w:pPr>
       <w:r>
-        <w:t xml:space="preserve">*Figure 10 — V7__add_partition_maintenance.sql créé.*</w:t>
-      </w:r>
-    </w:p>
-    <w:bookmarkEnd w:id="54"/>
-    <w:bookmarkStart w:id="58" w:name="succès-12-partitions-créées"/>
-    <w:p>
-      <w:pPr>
-        <w:pStyle w:val="Heading4"/>
-      </w:pPr>
-      <w:r>
-        <w:rPr>
-          <w:rStyle w:val="SectionNumber"/>
-        </w:rPr>
-        <w:t xml:space="preserve">1.3.6.2</w:t>
-      </w:r>
-      <w:r>
-        <w:tab/>
-      </w:r>
-      <w:r>
-        <w:t xml:space="preserve">5.2. Succès — 12 partitions créées</w:t>
+        <w:rPr>
+          <w:i/>
+          <w:iCs/>
+        </w:rPr>
+        <w:t xml:space="preserve">Figure 4 — Diagnostic : indentation TAB détectée dans le pom.xml.</w:t>
       </w:r>
     </w:p>
     <w:p>
@@ -3039,20 +2937,20 @@
       <w:r>
         <w:drawing>
           <wp:inline>
-            <wp:extent cx="4552749" cy="1299410"/>
+            <wp:extent cx="5334000" cy="1866899"/>
             <wp:effectExtent b="0" l="0" r="0" t="0"/>
-            <wp:docPr descr="Endpoint success" title="" id="56" name="Picture"/>
+            <wp:docPr descr="Dépendances pom.xml" title="" id="53" name="Picture"/>
             <a:graphic>
               <a:graphicData uri="http://schemas.openxmlformats.org/drawingml/2006/picture">
                 <pic:pic>
                   <pic:nvPicPr>
-                    <pic:cNvPr descr="/home/idrissa_yameogo/projets/ycognicore-cloud/docs/rapports/captures/10/30-endpoint-success.png" id="57" name="Picture"/>
+                    <pic:cNvPr descr="/home/idrissa_yameogo/projets/ycognicore-cloud/docs/rapports/captures/10/09-flyway-pom.png" id="54" name="Picture"/>
                     <pic:cNvPicPr>
                       <a:picLocks noChangeArrowheads="1" noChangeAspect="1"/>
                     </pic:cNvPicPr>
                   </pic:nvPicPr>
                   <pic:blipFill>
-                    <a:blip r:embed="rId55"/>
+                    <a:blip r:embed="rId52"/>
                     <a:stretch>
                       <a:fillRect/>
                     </a:stretch>
@@ -3060,7 +2958,7 @@
                   <pic:spPr bwMode="auto">
                     <a:xfrm>
                       <a:off x="0" y="0"/>
-                      <a:ext cx="4552749" cy="1299410"/>
+                      <a:ext cx="5334000" cy="1866899"/>
                     </a:xfrm>
                     <a:prstGeom prst="rect">
                       <a:avLst/>
@@ -3084,7 +2982,7 @@
         <w:pStyle w:val="ImageCaption"/>
       </w:pPr>
       <w:r>
-        <w:t xml:space="preserve">Endpoint success</w:t>
+        <w:t xml:space="preserve">Dépendances pom.xml</w:t>
       </w:r>
     </w:p>
     <w:p>
@@ -3096,34 +2994,11 @@
           <w:i/>
           <w:iCs/>
         </w:rPr>
-        <w:t xml:space="preserve">Figure 11 — POST /api/admin/partitions/run :</w:t>
-      </w:r>
-      <w:r>
-        <w:rPr>
-          <w:i/>
-          <w:iCs/>
-        </w:rPr>
-        <w:t xml:space="preserve"> </w:t>
-      </w:r>
-      <w:r>
-        <w:rPr>
-          <w:b/>
-          <w:bCs/>
-          <w:i/>
-          <w:iCs/>
-        </w:rPr>
-        <w:t xml:space="preserve">nbPartitionsCreees: 12, nbErreurs: 0</w:t>
-      </w:r>
-      <w:r>
-        <w:rPr>
-          <w:i/>
-          <w:iCs/>
-        </w:rPr>
-        <w:t xml:space="preserve">.</w:t>
-      </w:r>
-    </w:p>
-    <w:bookmarkEnd w:id="58"/>
-    <w:bookmarkStart w:id="62" w:name="vérification-en-base"/>
+        <w:t xml:space="preserve">Figure 5 — Ajout des dépendances Flyway + vérification visuelle.</w:t>
+      </w:r>
+    </w:p>
+    <w:bookmarkEnd w:id="55"/>
+    <w:bookmarkStart w:id="59" w:name="validation-et-compilation"/>
     <w:p>
       <w:pPr>
         <w:pStyle w:val="Heading4"/>
@@ -3132,13 +3007,13 @@
         <w:rPr>
           <w:rStyle w:val="SectionNumber"/>
         </w:rPr>
-        <w:t xml:space="preserve">1.3.6.3</w:t>
+        <w:t xml:space="preserve">3.5.2</w:t>
       </w:r>
       <w:r>
         <w:tab/>
       </w:r>
       <w:r>
-        <w:t xml:space="preserve">5.3. Vérification en base</w:t>
+        <w:t xml:space="preserve">4.2. Validation et compilation</w:t>
       </w:r>
     </w:p>
     <w:p>
@@ -3148,20 +3023,20 @@
       <w:r>
         <w:drawing>
           <wp:inline>
-            <wp:extent cx="5334000" cy="1542845"/>
+            <wp:extent cx="5334000" cy="1333500"/>
             <wp:effectExtent b="0" l="0" r="0" t="0"/>
-            <wp:docPr descr="Partitions demo001" title="" id="60" name="Picture"/>
+            <wp:docPr descr="Validation OK" title="" id="57" name="Picture"/>
             <a:graphic>
               <a:graphicData uri="http://schemas.openxmlformats.org/drawingml/2006/picture">
                 <pic:pic>
                   <pic:nvPicPr>
-                    <pic:cNvPr descr="/home/idrissa_yameogo/projets/ycognicore-cloud/docs/rapports/captures/10/31-partitions-demo001.png" id="61" name="Picture"/>
+                    <pic:cNvPr descr="/home/idrissa_yameogo/projets/ycognicore-cloud/docs/rapports/captures/10/10-validation-compilation.png" id="58" name="Picture"/>
                     <pic:cNvPicPr>
                       <a:picLocks noChangeArrowheads="1" noChangeAspect="1"/>
                     </pic:cNvPicPr>
                   </pic:nvPicPr>
                   <pic:blipFill>
-                    <a:blip r:embed="rId59"/>
+                    <a:blip r:embed="rId56"/>
                     <a:stretch>
                       <a:fillRect/>
                     </a:stretch>
@@ -3169,7 +3044,7 @@
                   <pic:spPr bwMode="auto">
                     <a:xfrm>
                       <a:off x="0" y="0"/>
-                      <a:ext cx="5334000" cy="1542845"/>
+                      <a:ext cx="5334000" cy="1333500"/>
                     </a:xfrm>
                     <a:prstGeom prst="rect">
                       <a:avLst/>
@@ -3193,7 +3068,7 @@
         <w:pStyle w:val="ImageCaption"/>
       </w:pPr>
       <w:r>
-        <w:t xml:space="preserve">Partitions demo001</w:t>
+        <w:t xml:space="preserve">Validation OK</w:t>
       </w:r>
     </w:p>
     <w:p>
@@ -3205,11 +3080,11 @@
           <w:i/>
           <w:iCs/>
         </w:rPr>
-        <w:t xml:space="preserve">Figure 12 — demo001 : 30 objets (3 audit_log + 3 login_attempts + index hérités).</w:t>
-      </w:r>
-    </w:p>
-    <w:bookmarkEnd w:id="62"/>
-    <w:bookmarkStart w:id="66" w:name="journal-de-traçabilité"/>
+        <w:t xml:space="preserve">Figure 6 — XML valide + compilation OK.</w:t>
+      </w:r>
+    </w:p>
+    <w:bookmarkEnd w:id="59"/>
+    <w:bookmarkStart w:id="63" w:name="configuration-application.yml"/>
     <w:p>
       <w:pPr>
         <w:pStyle w:val="Heading4"/>
@@ -3218,13 +3093,13 @@
         <w:rPr>
           <w:rStyle w:val="SectionNumber"/>
         </w:rPr>
-        <w:t xml:space="preserve">1.3.6.4</w:t>
+        <w:t xml:space="preserve">3.5.3</w:t>
       </w:r>
       <w:r>
         <w:tab/>
       </w:r>
       <w:r>
-        <w:t xml:space="preserve">5.4. Journal de traçabilité</w:t>
+        <w:t xml:space="preserve">4.3. Configuration application.yml</w:t>
       </w:r>
     </w:p>
     <w:p>
@@ -3234,20 +3109,20 @@
       <w:r>
         <w:drawing>
           <wp:inline>
-            <wp:extent cx="5334000" cy="875731"/>
+            <wp:extent cx="5334000" cy="4533900"/>
             <wp:effectExtent b="0" l="0" r="0" t="0"/>
-            <wp:docPr descr="Journal CP" title="" id="64" name="Picture"/>
+            <wp:docPr descr="application.yml" title="" id="61" name="Picture"/>
             <a:graphic>
               <a:graphicData uri="http://schemas.openxmlformats.org/drawingml/2006/picture">
                 <pic:pic>
                   <pic:nvPicPr>
-                    <pic:cNvPr descr="/home/idrissa_yameogo/projets/ycognicore-cloud/docs/rapports/captures/10/33-journal-cp.png" id="65" name="Picture"/>
+                    <pic:cNvPr descr="/home/idrissa_yameogo/projets/ycognicore-cloud/docs/rapports/captures/10/11-application-yml.png" id="62" name="Picture"/>
                     <pic:cNvPicPr>
                       <a:picLocks noChangeArrowheads="1" noChangeAspect="1"/>
                     </pic:cNvPicPr>
                   </pic:nvPicPr>
                   <pic:blipFill>
-                    <a:blip r:embed="rId63"/>
+                    <a:blip r:embed="rId60"/>
                     <a:stretch>
                       <a:fillRect/>
                     </a:stretch>
@@ -3255,7 +3130,7 @@
                   <pic:spPr bwMode="auto">
                     <a:xfrm>
                       <a:off x="0" y="0"/>
-                      <a:ext cx="5334000" cy="875731"/>
+                      <a:ext cx="5334000" cy="4533900"/>
                     </a:xfrm>
                     <a:prstGeom prst="rect">
                       <a:avLst/>
@@ -3279,7 +3154,7 @@
         <w:pStyle w:val="ImageCaption"/>
       </w:pPr>
       <w:r>
-        <w:t xml:space="preserve">Journal CP</w:t>
+        <w:t xml:space="preserve">application.yml</w:t>
       </w:r>
     </w:p>
     <w:p>
@@ -3291,88 +3166,26 @@
           <w:i/>
           <w:iCs/>
         </w:rPr>
-        <w:t xml:space="preserve">Figure 13 — partition_maintenance_log : SUCCES=12, ECHEC=12.</w:t>
-      </w:r>
-    </w:p>
-    <w:p>
-      <w:pPr>
-        <w:pStyle w:val="BodyText"/>
-      </w:pPr>
-      <w:r>
-        <w:rPr>
-          <w:b/>
-          <w:bCs/>
-        </w:rPr>
-        <w:t xml:space="preserve">Durée effective :</w:t>
-      </w:r>
-      <w:r>
-        <w:t xml:space="preserve"> </w:t>
-      </w:r>
-      <w:r>
-        <w:t xml:space="preserve">1 heure.</w:t>
-      </w:r>
-    </w:p>
-    <w:p>
-      <w:r>
-        <w:pict>
-          <v:rect style="width:0;height:1.5pt" o:hralign="center" o:hrstd="t" o:hr="t"/>
-        </w:pict>
-      </w:r>
-    </w:p>
-    <w:bookmarkEnd w:id="66"/>
-    <w:bookmarkEnd w:id="67"/>
-    <w:bookmarkStart w:id="84" w:name="Xc5e749f703e9ed7cf8ab9c8eacceb0ab3cee905"/>
-    <w:p>
-      <w:pPr>
-        <w:pStyle w:val="Heading3"/>
+        <w:t xml:space="preserve">Figure 7 — application.yml créé (49 lignes).</w:t>
+      </w:r>
+    </w:p>
+    <w:bookmarkEnd w:id="63"/>
+    <w:bookmarkStart w:id="67" w:name="X95d9e40fc665da7fd7856f0428a762436f5d3db"/>
+    <w:p>
+      <w:pPr>
+        <w:pStyle w:val="Heading4"/>
       </w:pPr>
       <w:r>
         <w:rPr>
           <w:rStyle w:val="SectionNumber"/>
         </w:rPr>
-        <w:t xml:space="preserve">1.3.7</w:t>
+        <w:t xml:space="preserve">3.5.4</w:t>
       </w:r>
       <w:r>
         <w:tab/>
       </w:r>
       <w:r>
-        <w:t xml:space="preserve">Tâche 6 — Docker Compose complet (BLOC 5 — BL-006)</w:t>
-      </w:r>
-    </w:p>
-    <w:p>
-      <w:pPr>
-        <w:pStyle w:val="FirstParagraph"/>
-      </w:pPr>
-      <w:r>
-        <w:rPr>
-          <w:b/>
-          <w:bCs/>
-        </w:rPr>
-        <w:t xml:space="preserve">Objectif :</w:t>
-      </w:r>
-      <w:r>
-        <w:t xml:space="preserve"> </w:t>
-      </w:r>
-      <w:r>
-        <w:t xml:space="preserve">provisionner 4 services sans perte de données.</w:t>
-      </w:r>
-    </w:p>
-    <w:bookmarkStart w:id="71" w:name="analyse-des-volumes-et-ports"/>
-    <w:p>
-      <w:pPr>
-        <w:pStyle w:val="Heading4"/>
-      </w:pPr>
-      <w:r>
-        <w:rPr>
-          <w:rStyle w:val="SectionNumber"/>
-        </w:rPr>
-        <w:t xml:space="preserve">1.3.7.1</w:t>
-      </w:r>
-      <w:r>
-        <w:tab/>
-      </w:r>
-      <w:r>
-        <w:t xml:space="preserve">6.1. Analyse des volumes et ports</w:t>
+        <w:t xml:space="preserve">4.4. Problème : Spring Boot 4 sans starter Flyway</w:t>
       </w:r>
     </w:p>
     <w:p>
@@ -3382,20 +3195,20 @@
       <w:r>
         <w:drawing>
           <wp:inline>
-            <wp:extent cx="5334000" cy="975032"/>
+            <wp:extent cx="5334000" cy="2576811"/>
             <wp:effectExtent b="0" l="0" r="0" t="0"/>
-            <wp:docPr descr="Volumes Docker" title="" id="69" name="Picture"/>
+            <wp:docPr descr="Starters Boot 4" title="" id="65" name="Picture"/>
             <a:graphic>
               <a:graphicData uri="http://schemas.openxmlformats.org/drawingml/2006/picture">
                 <pic:pic>
                   <pic:nvPicPr>
-                    <pic:cNvPr descr="/home/idrissa_yameogo/projets/ycognicore-cloud/docs/rapports/captures/10/35-volumes.png" id="70" name="Picture"/>
+                    <pic:cNvPr descr="/home/idrissa_yameogo/projets/ycognicore-cloud/docs/rapports/captures/10/16-boot4-starters.png" id="66" name="Picture"/>
                     <pic:cNvPicPr>
                       <a:picLocks noChangeArrowheads="1" noChangeAspect="1"/>
                     </pic:cNvPicPr>
                   </pic:nvPicPr>
                   <pic:blipFill>
-                    <a:blip r:embed="rId68"/>
+                    <a:blip r:embed="rId64"/>
                     <a:stretch>
                       <a:fillRect/>
                     </a:stretch>
@@ -3403,7 +3216,7 @@
                   <pic:spPr bwMode="auto">
                     <a:xfrm>
                       <a:off x="0" y="0"/>
-                      <a:ext cx="5334000" cy="975032"/>
+                      <a:ext cx="5334000" cy="2576811"/>
                     </a:xfrm>
                     <a:prstGeom prst="rect">
                       <a:avLst/>
@@ -3427,7 +3240,7 @@
         <w:pStyle w:val="ImageCaption"/>
       </w:pPr>
       <w:r>
-        <w:t xml:space="preserve">Volumes Docker</w:t>
+        <w:t xml:space="preserve">Starters Boot 4</w:t>
       </w:r>
     </w:p>
     <w:p>
@@ -3439,40 +3252,11 @@
           <w:i/>
           <w:iCs/>
         </w:rPr>
-        <w:t xml:space="preserve">Figure 14 — Volume</w:t>
-      </w:r>
-      <w:r>
-        <w:rPr>
-          <w:i/>
-          <w:iCs/>
-        </w:rPr>
-        <w:t xml:space="preserve"> </w:t>
-      </w:r>
-      <w:r>
-        <w:rPr>
-          <w:rStyle w:val="VerbatimChar"/>
-          <w:i/>
-          <w:iCs/>
-        </w:rPr>
-        <w:t xml:space="preserve">pg_ycc_data</w:t>
-      </w:r>
-      <w:r>
-        <w:rPr>
-          <w:i/>
-          <w:iCs/>
-        </w:rPr>
-        <w:t xml:space="preserve"> </w:t>
-      </w:r>
-      <w:r>
-        <w:rPr>
-          <w:i/>
-          <w:iCs/>
-        </w:rPr>
-        <w:t xml:space="preserve">(85 Mo) identifié pour réutilisation.</w:t>
-      </w:r>
-    </w:p>
-    <w:bookmarkEnd w:id="71"/>
-    <w:bookmarkStart w:id="75" w:name="fichiers-dinfrastructure-validation"/>
+        <w:t xml:space="preserve">Figure 8 — Diagnostic : aucun starter Flyway n’existe pour Boot 4.</w:t>
+      </w:r>
+    </w:p>
+    <w:bookmarkEnd w:id="67"/>
+    <w:bookmarkStart w:id="71" w:name="résultat-6-puis-7-migrations-appliquées"/>
     <w:p>
       <w:pPr>
         <w:pStyle w:val="Heading4"/>
@@ -3481,13 +3265,13 @@
         <w:rPr>
           <w:rStyle w:val="SectionNumber"/>
         </w:rPr>
-        <w:t xml:space="preserve">1.3.7.2</w:t>
+        <w:t xml:space="preserve">3.5.5</w:t>
       </w:r>
       <w:r>
         <w:tab/>
       </w:r>
       <w:r>
-        <w:t xml:space="preserve">6.2. Fichiers d’infrastructure + validation</w:t>
+        <w:t xml:space="preserve">4.5. Résultat — 6 puis 7 migrations appliquées</w:t>
       </w:r>
     </w:p>
     <w:p>
@@ -3497,20 +3281,731 @@
       <w:r>
         <w:drawing>
           <wp:inline>
-            <wp:extent cx="5334000" cy="2435208"/>
+            <wp:extent cx="5334000" cy="1331986"/>
             <wp:effectExtent b="0" l="0" r="0" t="0"/>
-            <wp:docPr descr="Validation YAML" title="" id="73" name="Picture"/>
+            <wp:docPr descr="Flyway history" title="" id="69" name="Picture"/>
             <a:graphic>
               <a:graphicData uri="http://schemas.openxmlformats.org/drawingml/2006/picture">
                 <pic:pic>
                   <pic:nvPicPr>
-                    <pic:cNvPr descr="/home/idrissa_yameogo/projets/ycognicore-cloud/docs/rapports/captures/10/38-validation-yaml.png" id="74" name="Picture"/>
+                    <pic:cNvPr descr="/home/idrissa_yameogo/projets/ycognicore-cloud/docs/rapports/captures/10/19-flyway-history.png" id="70" name="Picture"/>
                     <pic:cNvPicPr>
                       <a:picLocks noChangeArrowheads="1" noChangeAspect="1"/>
                     </pic:cNvPicPr>
                   </pic:nvPicPr>
                   <pic:blipFill>
-                    <a:blip r:embed="rId72"/>
+                    <a:blip r:embed="rId68"/>
+                    <a:stretch>
+                      <a:fillRect/>
+                    </a:stretch>
+                  </pic:blipFill>
+                  <pic:spPr bwMode="auto">
+                    <a:xfrm>
+                      <a:off x="0" y="0"/>
+                      <a:ext cx="5334000" cy="1331986"/>
+                    </a:xfrm>
+                    <a:prstGeom prst="rect">
+                      <a:avLst/>
+                    </a:prstGeom>
+                    <a:noFill/>
+                    <a:ln w="9525">
+                      <a:noFill/>
+                      <a:headEnd/>
+                      <a:tailEnd/>
+                    </a:ln>
+                  </pic:spPr>
+                </pic:pic>
+              </a:graphicData>
+            </a:graphic>
+          </wp:inline>
+        </w:drawing>
+      </w:r>
+    </w:p>
+    <w:p>
+      <w:pPr>
+        <w:pStyle w:val="ImageCaption"/>
+      </w:pPr>
+      <w:r>
+        <w:t xml:space="preserve">Flyway history</w:t>
+      </w:r>
+    </w:p>
+    <w:p>
+      <w:pPr>
+        <w:pStyle w:val="BodyText"/>
+      </w:pPr>
+      <w:r>
+        <w:rPr>
+          <w:i/>
+          <w:iCs/>
+        </w:rPr>
+        <w:t xml:space="preserve">Figure 9 — flyway_schema_history : 7 migrations (V1 à V7).</w:t>
+      </w:r>
+    </w:p>
+    <w:p>
+      <w:pPr>
+        <w:pStyle w:val="BodyText"/>
+      </w:pPr>
+      <w:r>
+        <w:rPr>
+          <w:b/>
+          <w:bCs/>
+        </w:rPr>
+        <w:t xml:space="preserve">Durée effective :</w:t>
+      </w:r>
+      <w:r>
+        <w:t xml:space="preserve"> </w:t>
+      </w:r>
+      <w:r>
+        <w:t xml:space="preserve">1 heure.</w:t>
+      </w:r>
+    </w:p>
+    <w:p>
+      <w:r>
+        <w:pict>
+          <v:rect style="width:0;height:1.5pt" o:hralign="center" o:hrstd="t" o:hr="t"/>
+        </w:pict>
+      </w:r>
+    </w:p>
+    <w:bookmarkEnd w:id="71"/>
+    <w:bookmarkEnd w:id="72"/>
+    <w:bookmarkStart w:id="89" w:name="X9413cbdb2b853f865b13181a204bdc1cb34990b"/>
+    <w:p>
+      <w:pPr>
+        <w:pStyle w:val="Heading3"/>
+      </w:pPr>
+      <w:r>
+        <w:rPr>
+          <w:rStyle w:val="SectionNumber"/>
+        </w:rPr>
+        <w:t xml:space="preserve">3.6</w:t>
+      </w:r>
+      <w:r>
+        <w:tab/>
+      </w:r>
+      <w:r>
+        <w:t xml:space="preserve">Tâche 5 — Maintenance automatique des partitions (BLOC 4 — BL-005)</w:t>
+      </w:r>
+    </w:p>
+    <w:p>
+      <w:pPr>
+        <w:pStyle w:val="FirstParagraph"/>
+      </w:pPr>
+      <w:r>
+        <w:rPr>
+          <w:b/>
+          <w:bCs/>
+        </w:rPr>
+        <w:t xml:space="preserve">Objectif :</w:t>
+      </w:r>
+      <w:r>
+        <w:t xml:space="preserve"> </w:t>
+      </w:r>
+      <w:r>
+        <w:t xml:space="preserve">automatiser la création des partitions mensuelles.</w:t>
+      </w:r>
+    </w:p>
+    <w:bookmarkStart w:id="76" w:name="création-de-la-migration-v7"/>
+    <w:p>
+      <w:pPr>
+        <w:pStyle w:val="Heading4"/>
+      </w:pPr>
+      <w:r>
+        <w:rPr>
+          <w:rStyle w:val="SectionNumber"/>
+        </w:rPr>
+        <w:t xml:space="preserve">3.6.1</w:t>
+      </w:r>
+      <w:r>
+        <w:tab/>
+      </w:r>
+      <w:r>
+        <w:t xml:space="preserve">5.1. Création de la migration V7</w:t>
+      </w:r>
+    </w:p>
+    <w:p>
+      <w:pPr>
+        <w:pStyle w:val="FirstParagraph"/>
+      </w:pPr>
+      <w:r>
+        <w:t xml:space="preserve">Table</w:t>
+      </w:r>
+      <w:r>
+        <w:t xml:space="preserve"> </w:t>
+      </w:r>
+      <w:r>
+        <w:rPr>
+          <w:rStyle w:val="VerbatimChar"/>
+        </w:rPr>
+        <w:t xml:space="preserve">partition_maintenance_log</w:t>
+      </w:r>
+      <w:r>
+        <w:t xml:space="preserve"> </w:t>
+      </w:r>
+      <w:r>
+        <w:t xml:space="preserve">avec traçabilité complète.</w:t>
+      </w:r>
+    </w:p>
+    <w:p>
+      <w:pPr>
+        <w:pStyle w:val="CaptionedFigure"/>
+      </w:pPr>
+      <w:r>
+        <w:drawing>
+          <wp:inline>
+            <wp:extent cx="5334000" cy="2014482"/>
+            <wp:effectExtent b="0" l="0" r="0" t="0"/>
+            <wp:docPr descr="V7 créé" title="" id="74" name="Picture"/>
+            <a:graphic>
+              <a:graphicData uri="http://schemas.openxmlformats.org/drawingml/2006/picture">
+                <pic:pic>
+                  <pic:nvPicPr>
+                    <pic:cNvPr descr="/home/idrissa_yameogo/projets/ycognicore-cloud/docs/rapports/captures/10/23-v7-created.png" id="75" name="Picture"/>
+                    <pic:cNvPicPr>
+                      <a:picLocks noChangeArrowheads="1" noChangeAspect="1"/>
+                    </pic:cNvPicPr>
+                  </pic:nvPicPr>
+                  <pic:blipFill>
+                    <a:blip r:embed="rId73"/>
+                    <a:stretch>
+                      <a:fillRect/>
+                    </a:stretch>
+                  </pic:blipFill>
+                  <pic:spPr bwMode="auto">
+                    <a:xfrm>
+                      <a:off x="0" y="0"/>
+                      <a:ext cx="5334000" cy="2014482"/>
+                    </a:xfrm>
+                    <a:prstGeom prst="rect">
+                      <a:avLst/>
+                    </a:prstGeom>
+                    <a:noFill/>
+                    <a:ln w="9525">
+                      <a:noFill/>
+                      <a:headEnd/>
+                      <a:tailEnd/>
+                    </a:ln>
+                  </pic:spPr>
+                </pic:pic>
+              </a:graphicData>
+            </a:graphic>
+          </wp:inline>
+        </w:drawing>
+      </w:r>
+    </w:p>
+    <w:p>
+      <w:pPr>
+        <w:pStyle w:val="ImageCaption"/>
+      </w:pPr>
+      <w:r>
+        <w:t xml:space="preserve">V7 créé</w:t>
+      </w:r>
+    </w:p>
+    <w:p>
+      <w:pPr>
+        <w:pStyle w:val="BodyText"/>
+      </w:pPr>
+      <w:r>
+        <w:t xml:space="preserve">*Figure 10 — V7__add_partition_maintenance.sql créé.*</w:t>
+      </w:r>
+    </w:p>
+    <w:bookmarkEnd w:id="76"/>
+    <w:bookmarkStart w:id="80" w:name="succès-12-partitions-créées"/>
+    <w:p>
+      <w:pPr>
+        <w:pStyle w:val="Heading4"/>
+      </w:pPr>
+      <w:r>
+        <w:rPr>
+          <w:rStyle w:val="SectionNumber"/>
+        </w:rPr>
+        <w:t xml:space="preserve">3.6.2</w:t>
+      </w:r>
+      <w:r>
+        <w:tab/>
+      </w:r>
+      <w:r>
+        <w:t xml:space="preserve">5.2. Succès — 12 partitions créées</w:t>
+      </w:r>
+    </w:p>
+    <w:p>
+      <w:pPr>
+        <w:pStyle w:val="CaptionedFigure"/>
+      </w:pPr>
+      <w:r>
+        <w:drawing>
+          <wp:inline>
+            <wp:extent cx="5334000" cy="1231515"/>
+            <wp:effectExtent b="0" l="0" r="0" t="0"/>
+            <wp:docPr descr="Endpoint success" title="" id="78" name="Picture"/>
+            <a:graphic>
+              <a:graphicData uri="http://schemas.openxmlformats.org/drawingml/2006/picture">
+                <pic:pic>
+                  <pic:nvPicPr>
+                    <pic:cNvPr descr="/home/idrissa_yameogo/projets/ycognicore-cloud/docs/rapports/captures/10/30-endpoint-success.png" id="79" name="Picture"/>
+                    <pic:cNvPicPr>
+                      <a:picLocks noChangeArrowheads="1" noChangeAspect="1"/>
+                    </pic:cNvPicPr>
+                  </pic:nvPicPr>
+                  <pic:blipFill>
+                    <a:blip r:embed="rId77"/>
+                    <a:stretch>
+                      <a:fillRect/>
+                    </a:stretch>
+                  </pic:blipFill>
+                  <pic:spPr bwMode="auto">
+                    <a:xfrm>
+                      <a:off x="0" y="0"/>
+                      <a:ext cx="5334000" cy="1231515"/>
+                    </a:xfrm>
+                    <a:prstGeom prst="rect">
+                      <a:avLst/>
+                    </a:prstGeom>
+                    <a:noFill/>
+                    <a:ln w="9525">
+                      <a:noFill/>
+                      <a:headEnd/>
+                      <a:tailEnd/>
+                    </a:ln>
+                  </pic:spPr>
+                </pic:pic>
+              </a:graphicData>
+            </a:graphic>
+          </wp:inline>
+        </w:drawing>
+      </w:r>
+    </w:p>
+    <w:p>
+      <w:pPr>
+        <w:pStyle w:val="ImageCaption"/>
+      </w:pPr>
+      <w:r>
+        <w:t xml:space="preserve">Endpoint success</w:t>
+      </w:r>
+    </w:p>
+    <w:p>
+      <w:pPr>
+        <w:pStyle w:val="BodyText"/>
+      </w:pPr>
+      <w:r>
+        <w:rPr>
+          <w:i/>
+          <w:iCs/>
+        </w:rPr>
+        <w:t xml:space="preserve">Figure 11 — POST /api/admin/partitions/run :</w:t>
+      </w:r>
+      <w:r>
+        <w:rPr>
+          <w:i/>
+          <w:iCs/>
+        </w:rPr>
+        <w:t xml:space="preserve"> </w:t>
+      </w:r>
+      <w:r>
+        <w:rPr>
+          <w:b/>
+          <w:bCs/>
+          <w:i/>
+          <w:iCs/>
+        </w:rPr>
+        <w:t xml:space="preserve">nbPartitionsCreees: 12, nbErreurs: 0</w:t>
+      </w:r>
+      <w:r>
+        <w:rPr>
+          <w:i/>
+          <w:iCs/>
+        </w:rPr>
+        <w:t xml:space="preserve">.</w:t>
+      </w:r>
+    </w:p>
+    <w:bookmarkEnd w:id="80"/>
+    <w:bookmarkStart w:id="84" w:name="vérification-en-base"/>
+    <w:p>
+      <w:pPr>
+        <w:pStyle w:val="Heading4"/>
+      </w:pPr>
+      <w:r>
+        <w:rPr>
+          <w:rStyle w:val="SectionNumber"/>
+        </w:rPr>
+        <w:t xml:space="preserve">3.6.3</w:t>
+      </w:r>
+      <w:r>
+        <w:tab/>
+      </w:r>
+      <w:r>
+        <w:t xml:space="preserve">5.3. Vérification en base</w:t>
+      </w:r>
+    </w:p>
+    <w:p>
+      <w:pPr>
+        <w:pStyle w:val="CaptionedFigure"/>
+      </w:pPr>
+      <w:r>
+        <w:drawing>
+          <wp:inline>
+            <wp:extent cx="5334000" cy="2572668"/>
+            <wp:effectExtent b="0" l="0" r="0" t="0"/>
+            <wp:docPr descr="Partitions demo001" title="" id="82" name="Picture"/>
+            <a:graphic>
+              <a:graphicData uri="http://schemas.openxmlformats.org/drawingml/2006/picture">
+                <pic:pic>
+                  <pic:nvPicPr>
+                    <pic:cNvPr descr="/home/idrissa_yameogo/projets/ycognicore-cloud/docs/rapports/captures/10/31-partitions-demo001.png" id="83" name="Picture"/>
+                    <pic:cNvPicPr>
+                      <a:picLocks noChangeArrowheads="1" noChangeAspect="1"/>
+                    </pic:cNvPicPr>
+                  </pic:nvPicPr>
+                  <pic:blipFill>
+                    <a:blip r:embed="rId81"/>
+                    <a:stretch>
+                      <a:fillRect/>
+                    </a:stretch>
+                  </pic:blipFill>
+                  <pic:spPr bwMode="auto">
+                    <a:xfrm>
+                      <a:off x="0" y="0"/>
+                      <a:ext cx="5334000" cy="2572668"/>
+                    </a:xfrm>
+                    <a:prstGeom prst="rect">
+                      <a:avLst/>
+                    </a:prstGeom>
+                    <a:noFill/>
+                    <a:ln w="9525">
+                      <a:noFill/>
+                      <a:headEnd/>
+                      <a:tailEnd/>
+                    </a:ln>
+                  </pic:spPr>
+                </pic:pic>
+              </a:graphicData>
+            </a:graphic>
+          </wp:inline>
+        </w:drawing>
+      </w:r>
+    </w:p>
+    <w:p>
+      <w:pPr>
+        <w:pStyle w:val="ImageCaption"/>
+      </w:pPr>
+      <w:r>
+        <w:t xml:space="preserve">Partitions demo001</w:t>
+      </w:r>
+    </w:p>
+    <w:p>
+      <w:pPr>
+        <w:pStyle w:val="BodyText"/>
+      </w:pPr>
+      <w:r>
+        <w:rPr>
+          <w:i/>
+          <w:iCs/>
+        </w:rPr>
+        <w:t xml:space="preserve">Figure 12 — demo001 : 30 objets (3 audit_log + 3 login_attempts + index hérités).</w:t>
+      </w:r>
+    </w:p>
+    <w:bookmarkEnd w:id="84"/>
+    <w:bookmarkStart w:id="88" w:name="journal-de-traçabilité"/>
+    <w:p>
+      <w:pPr>
+        <w:pStyle w:val="Heading4"/>
+      </w:pPr>
+      <w:r>
+        <w:rPr>
+          <w:rStyle w:val="SectionNumber"/>
+        </w:rPr>
+        <w:t xml:space="preserve">3.6.4</w:t>
+      </w:r>
+      <w:r>
+        <w:tab/>
+      </w:r>
+      <w:r>
+        <w:t xml:space="preserve">5.4. Journal de traçabilité</w:t>
+      </w:r>
+    </w:p>
+    <w:p>
+      <w:pPr>
+        <w:pStyle w:val="CaptionedFigure"/>
+      </w:pPr>
+      <w:r>
+        <w:drawing>
+          <wp:inline>
+            <wp:extent cx="5334000" cy="1126434"/>
+            <wp:effectExtent b="0" l="0" r="0" t="0"/>
+            <wp:docPr descr="Journal CP" title="" id="86" name="Picture"/>
+            <a:graphic>
+              <a:graphicData uri="http://schemas.openxmlformats.org/drawingml/2006/picture">
+                <pic:pic>
+                  <pic:nvPicPr>
+                    <pic:cNvPr descr="/home/idrissa_yameogo/projets/ycognicore-cloud/docs/rapports/captures/10/33-journal-cp.png" id="87" name="Picture"/>
+                    <pic:cNvPicPr>
+                      <a:picLocks noChangeArrowheads="1" noChangeAspect="1"/>
+                    </pic:cNvPicPr>
+                  </pic:nvPicPr>
+                  <pic:blipFill>
+                    <a:blip r:embed="rId85"/>
+                    <a:stretch>
+                      <a:fillRect/>
+                    </a:stretch>
+                  </pic:blipFill>
+                  <pic:spPr bwMode="auto">
+                    <a:xfrm>
+                      <a:off x="0" y="0"/>
+                      <a:ext cx="5334000" cy="1126434"/>
+                    </a:xfrm>
+                    <a:prstGeom prst="rect">
+                      <a:avLst/>
+                    </a:prstGeom>
+                    <a:noFill/>
+                    <a:ln w="9525">
+                      <a:noFill/>
+                      <a:headEnd/>
+                      <a:tailEnd/>
+                    </a:ln>
+                  </pic:spPr>
+                </pic:pic>
+              </a:graphicData>
+            </a:graphic>
+          </wp:inline>
+        </w:drawing>
+      </w:r>
+    </w:p>
+    <w:p>
+      <w:pPr>
+        <w:pStyle w:val="ImageCaption"/>
+      </w:pPr>
+      <w:r>
+        <w:t xml:space="preserve">Journal CP</w:t>
+      </w:r>
+    </w:p>
+    <w:p>
+      <w:pPr>
+        <w:pStyle w:val="BodyText"/>
+      </w:pPr>
+      <w:r>
+        <w:rPr>
+          <w:i/>
+          <w:iCs/>
+        </w:rPr>
+        <w:t xml:space="preserve">Figure 13 — partition_maintenance_log : SUCCES=12, ECHEC=12.</w:t>
+      </w:r>
+    </w:p>
+    <w:p>
+      <w:pPr>
+        <w:pStyle w:val="BodyText"/>
+      </w:pPr>
+      <w:r>
+        <w:rPr>
+          <w:b/>
+          <w:bCs/>
+        </w:rPr>
+        <w:t xml:space="preserve">Durée effective :</w:t>
+      </w:r>
+      <w:r>
+        <w:t xml:space="preserve"> </w:t>
+      </w:r>
+      <w:r>
+        <w:t xml:space="preserve">1 heure.</w:t>
+      </w:r>
+    </w:p>
+    <w:p>
+      <w:r>
+        <w:pict>
+          <v:rect style="width:0;height:1.5pt" o:hralign="center" o:hrstd="t" o:hr="t"/>
+        </w:pict>
+      </w:r>
+    </w:p>
+    <w:bookmarkEnd w:id="88"/>
+    <w:bookmarkEnd w:id="89"/>
+    <w:bookmarkStart w:id="106" w:name="Xc5e749f703e9ed7cf8ab9c8eacceb0ab3cee905"/>
+    <w:p>
+      <w:pPr>
+        <w:pStyle w:val="Heading3"/>
+      </w:pPr>
+      <w:r>
+        <w:rPr>
+          <w:rStyle w:val="SectionNumber"/>
+        </w:rPr>
+        <w:t xml:space="preserve">3.7</w:t>
+      </w:r>
+      <w:r>
+        <w:tab/>
+      </w:r>
+      <w:r>
+        <w:t xml:space="preserve">Tâche 6 — Docker Compose complet (BLOC 5 — BL-006)</w:t>
+      </w:r>
+    </w:p>
+    <w:p>
+      <w:pPr>
+        <w:pStyle w:val="FirstParagraph"/>
+      </w:pPr>
+      <w:r>
+        <w:rPr>
+          <w:b/>
+          <w:bCs/>
+        </w:rPr>
+        <w:t xml:space="preserve">Objectif :</w:t>
+      </w:r>
+      <w:r>
+        <w:t xml:space="preserve"> </w:t>
+      </w:r>
+      <w:r>
+        <w:t xml:space="preserve">provisionner 4 services sans perte de données.</w:t>
+      </w:r>
+    </w:p>
+    <w:bookmarkStart w:id="93" w:name="analyse-des-volumes-et-ports"/>
+    <w:p>
+      <w:pPr>
+        <w:pStyle w:val="Heading4"/>
+      </w:pPr>
+      <w:r>
+        <w:rPr>
+          <w:rStyle w:val="SectionNumber"/>
+        </w:rPr>
+        <w:t xml:space="preserve">3.7.1</w:t>
+      </w:r>
+      <w:r>
+        <w:tab/>
+      </w:r>
+      <w:r>
+        <w:t xml:space="preserve">6.1. Analyse des volumes et ports</w:t>
+      </w:r>
+    </w:p>
+    <w:p>
+      <w:pPr>
+        <w:pStyle w:val="CaptionedFigure"/>
+      </w:pPr>
+      <w:r>
+        <w:drawing>
+          <wp:inline>
+            <wp:extent cx="5334000" cy="1333500"/>
+            <wp:effectExtent b="0" l="0" r="0" t="0"/>
+            <wp:docPr descr="Volumes Docker" title="" id="91" name="Picture"/>
+            <a:graphic>
+              <a:graphicData uri="http://schemas.openxmlformats.org/drawingml/2006/picture">
+                <pic:pic>
+                  <pic:nvPicPr>
+                    <pic:cNvPr descr="/home/idrissa_yameogo/projets/ycognicore-cloud/docs/rapports/captures/10/35-volumes.png" id="92" name="Picture"/>
+                    <pic:cNvPicPr>
+                      <a:picLocks noChangeArrowheads="1" noChangeAspect="1"/>
+                    </pic:cNvPicPr>
+                  </pic:nvPicPr>
+                  <pic:blipFill>
+                    <a:blip r:embed="rId90"/>
+                    <a:stretch>
+                      <a:fillRect/>
+                    </a:stretch>
+                  </pic:blipFill>
+                  <pic:spPr bwMode="auto">
+                    <a:xfrm>
+                      <a:off x="0" y="0"/>
+                      <a:ext cx="5334000" cy="1333500"/>
+                    </a:xfrm>
+                    <a:prstGeom prst="rect">
+                      <a:avLst/>
+                    </a:prstGeom>
+                    <a:noFill/>
+                    <a:ln w="9525">
+                      <a:noFill/>
+                      <a:headEnd/>
+                      <a:tailEnd/>
+                    </a:ln>
+                  </pic:spPr>
+                </pic:pic>
+              </a:graphicData>
+            </a:graphic>
+          </wp:inline>
+        </w:drawing>
+      </w:r>
+    </w:p>
+    <w:p>
+      <w:pPr>
+        <w:pStyle w:val="ImageCaption"/>
+      </w:pPr>
+      <w:r>
+        <w:t xml:space="preserve">Volumes Docker</w:t>
+      </w:r>
+    </w:p>
+    <w:p>
+      <w:pPr>
+        <w:pStyle w:val="BodyText"/>
+      </w:pPr>
+      <w:r>
+        <w:rPr>
+          <w:i/>
+          <w:iCs/>
+        </w:rPr>
+        <w:t xml:space="preserve">Figure 14 — Volume</w:t>
+      </w:r>
+      <w:r>
+        <w:rPr>
+          <w:i/>
+          <w:iCs/>
+        </w:rPr>
+        <w:t xml:space="preserve"> </w:t>
+      </w:r>
+      <w:r>
+        <w:rPr>
+          <w:rStyle w:val="VerbatimChar"/>
+          <w:i/>
+          <w:iCs/>
+        </w:rPr>
+        <w:t xml:space="preserve">pg_ycc_data</w:t>
+      </w:r>
+      <w:r>
+        <w:rPr>
+          <w:i/>
+          <w:iCs/>
+        </w:rPr>
+        <w:t xml:space="preserve"> </w:t>
+      </w:r>
+      <w:r>
+        <w:rPr>
+          <w:i/>
+          <w:iCs/>
+        </w:rPr>
+        <w:t xml:space="preserve">(85 Mo) identifié pour réutilisation.</w:t>
+      </w:r>
+    </w:p>
+    <w:bookmarkEnd w:id="93"/>
+    <w:bookmarkStart w:id="97" w:name="fichiers-dinfrastructure-validation"/>
+    <w:p>
+      <w:pPr>
+        <w:pStyle w:val="Heading4"/>
+      </w:pPr>
+      <w:r>
+        <w:rPr>
+          <w:rStyle w:val="SectionNumber"/>
+        </w:rPr>
+        <w:t xml:space="preserve">3.7.2</w:t>
+      </w:r>
+      <w:r>
+        <w:tab/>
+      </w:r>
+      <w:r>
+        <w:t xml:space="preserve">6.2. Fichiers d’infrastructure + validation</w:t>
+      </w:r>
+    </w:p>
+    <w:p>
+      <w:pPr>
+        <w:pStyle w:val="CaptionedFigure"/>
+      </w:pPr>
+      <w:r>
+        <w:drawing>
+          <wp:inline>
+            <wp:extent cx="5334000" cy="2435208"/>
+            <wp:effectExtent b="0" l="0" r="0" t="0"/>
+            <wp:docPr descr="Validation YAML" title="" id="95" name="Picture"/>
+            <a:graphic>
+              <a:graphicData uri="http://schemas.openxmlformats.org/drawingml/2006/picture">
+                <pic:pic>
+                  <pic:nvPicPr>
+                    <pic:cNvPr descr="/home/idrissa_yameogo/projets/ycognicore-cloud/docs/rapports/captures/10/38-validation-yaml.png" id="96" name="Picture"/>
+                    <pic:cNvPicPr>
+                      <a:picLocks noChangeArrowheads="1" noChangeAspect="1"/>
+                    </pic:cNvPicPr>
+                  </pic:nvPicPr>
+                  <pic:blipFill>
+                    <a:blip r:embed="rId94"/>
                     <a:stretch>
                       <a:fillRect/>
                     </a:stretch>
@@ -3557,8 +4052,8 @@
         <w:t xml:space="preserve">Figure 15 — YAML docker-compose validé.</w:t>
       </w:r>
     </w:p>
-    <w:bookmarkEnd w:id="75"/>
-    <w:bookmarkStart w:id="79" w:name="démarrage-de-la-stack"/>
+    <w:bookmarkEnd w:id="97"/>
+    <w:bookmarkStart w:id="101" w:name="démarrage-de-la-stack"/>
     <w:p>
       <w:pPr>
         <w:pStyle w:val="Heading4"/>
@@ -3567,7 +4062,7 @@
         <w:rPr>
           <w:rStyle w:val="SectionNumber"/>
         </w:rPr>
-        <w:t xml:space="preserve">1.3.7.3</w:t>
+        <w:t xml:space="preserve">3.7.3</w:t>
       </w:r>
       <w:r>
         <w:tab/>
@@ -3583,20 +4078,20 @@
       <w:r>
         <w:drawing>
           <wp:inline>
-            <wp:extent cx="5334000" cy="2738782"/>
+            <wp:extent cx="5334000" cy="1422400"/>
             <wp:effectExtent b="0" l="0" r="0" t="0"/>
-            <wp:docPr descr="Docker compose up" title="" id="77" name="Picture"/>
+            <wp:docPr descr="Docker compose up" title="" id="99" name="Picture"/>
             <a:graphic>
               <a:graphicData uri="http://schemas.openxmlformats.org/drawingml/2006/picture">
                 <pic:pic>
                   <pic:nvPicPr>
-                    <pic:cNvPr descr="/home/idrissa_yameogo/projets/ycognicore-cloud/docs/rapports/captures/10/41-docker-up.png" id="78" name="Picture"/>
+                    <pic:cNvPr descr="/home/idrissa_yameogo/projets/ycognicore-cloud/docs/rapports/captures/10/41-docker-up.png" id="100" name="Picture"/>
                     <pic:cNvPicPr>
                       <a:picLocks noChangeArrowheads="1" noChangeAspect="1"/>
                     </pic:cNvPicPr>
                   </pic:nvPicPr>
                   <pic:blipFill>
-                    <a:blip r:embed="rId76"/>
+                    <a:blip r:embed="rId98"/>
                     <a:stretch>
                       <a:fillRect/>
                     </a:stretch>
@@ -3604,7 +4099,7 @@
                   <pic:spPr bwMode="auto">
                     <a:xfrm>
                       <a:off x="0" y="0"/>
-                      <a:ext cx="5334000" cy="2738782"/>
+                      <a:ext cx="5334000" cy="1422400"/>
                     </a:xfrm>
                     <a:prstGeom prst="rect">
                       <a:avLst/>
@@ -3643,8 +4138,8 @@
         <w:t xml:space="preserve">Figure 16 — Démarrage : 4 services, 1 réseau, 3 volumes.</w:t>
       </w:r>
     </w:p>
-    <w:bookmarkEnd w:id="79"/>
-    <w:bookmarkStart w:id="83" w:name="récapitulatif-infrastructure"/>
+    <w:bookmarkEnd w:id="101"/>
+    <w:bookmarkStart w:id="105" w:name="récapitulatif-infrastructure"/>
     <w:p>
       <w:pPr>
         <w:pStyle w:val="Heading4"/>
@@ -3653,7 +4148,7 @@
         <w:rPr>
           <w:rStyle w:val="SectionNumber"/>
         </w:rPr>
-        <w:t xml:space="preserve">1.3.7.4</w:t>
+        <w:t xml:space="preserve">3.7.4</w:t>
       </w:r>
       <w:r>
         <w:tab/>
@@ -3669,20 +4164,20 @@
       <w:r>
         <w:drawing>
           <wp:inline>
-            <wp:extent cx="5334000" cy="3180418"/>
+            <wp:extent cx="5334000" cy="1515978"/>
             <wp:effectExtent b="0" l="0" r="0" t="0"/>
-            <wp:docPr descr="Récapitulatif BL-006" title="" id="81" name="Picture"/>
+            <wp:docPr descr="Récapitulatif BL-006" title="" id="103" name="Picture"/>
             <a:graphic>
               <a:graphicData uri="http://schemas.openxmlformats.org/drawingml/2006/picture">
                 <pic:pic>
                   <pic:nvPicPr>
-                    <pic:cNvPr descr="/home/idrissa_yameogo/projets/ycognicore-cloud/docs/rapports/captures/10/48-recap-bl006.png" id="82" name="Picture"/>
+                    <pic:cNvPr descr="/home/idrissa_yameogo/projets/ycognicore-cloud/docs/rapports/captures/10/48-recap-bl006.png" id="104" name="Picture"/>
                     <pic:cNvPicPr>
                       <a:picLocks noChangeArrowheads="1" noChangeAspect="1"/>
                     </pic:cNvPicPr>
                   </pic:nvPicPr>
                   <pic:blipFill>
-                    <a:blip r:embed="rId80"/>
+                    <a:blip r:embed="rId102"/>
                     <a:stretch>
                       <a:fillRect/>
                     </a:stretch>
@@ -3690,7 +4185,7 @@
                   <pic:spPr bwMode="auto">
                     <a:xfrm>
                       <a:off x="0" y="0"/>
-                      <a:ext cx="5334000" cy="3180418"/>
+                      <a:ext cx="5334000" cy="1515978"/>
                     </a:xfrm>
                     <a:prstGeom prst="rect">
                       <a:avLst/>
@@ -3754,9 +4249,9 @@
         </w:pict>
       </w:r>
     </w:p>
-    <w:bookmarkEnd w:id="83"/>
-    <w:bookmarkEnd w:id="84"/>
-    <w:bookmarkStart w:id="85" w:name="tâche-7-nettoyage-et-clôture-bloc-6"/>
+    <w:bookmarkEnd w:id="105"/>
+    <w:bookmarkEnd w:id="106"/>
+    <w:bookmarkStart w:id="107" w:name="tâche-7-nettoyage-et-clôture-bloc-6"/>
     <w:p>
       <w:pPr>
         <w:pStyle w:val="Heading3"/>
@@ -3765,7 +4260,7 @@
         <w:rPr>
           <w:rStyle w:val="SectionNumber"/>
         </w:rPr>
-        <w:t xml:space="preserve">1.3.8</w:t>
+        <w:t xml:space="preserve">3.8</w:t>
       </w:r>
       <w:r>
         <w:tab/>
@@ -4065,9 +4560,9 @@
         </w:pict>
       </w:r>
     </w:p>
-    <w:bookmarkEnd w:id="85"/>
-    <w:bookmarkEnd w:id="86"/>
-    <w:bookmarkStart w:id="95" w:name="X4f2a54e9354a1e15ffae15d13fd6e327816f6d0"/>
+    <w:bookmarkEnd w:id="107"/>
+    <w:bookmarkEnd w:id="108"/>
+    <w:bookmarkStart w:id="135" w:name="X4f2a54e9354a1e15ffae15d13fd6e327816f6d0"/>
     <w:p>
       <w:pPr>
         <w:pStyle w:val="Heading2"/>
@@ -4076,7 +4571,7 @@
         <w:rPr>
           <w:rStyle w:val="SectionNumber"/>
         </w:rPr>
-        <w:t xml:space="preserve">1.4</w:t>
+        <w:t xml:space="preserve">4</w:t>
       </w:r>
       <w:r>
         <w:tab/>
@@ -4085,7 +4580,7 @@
         <w:t xml:space="preserve">3. Fonctionnalités développées, modifiées, corrigées ou testées</w:t>
       </w:r>
     </w:p>
-    <w:bookmarkStart w:id="92" w:name="fonctionnalités-développées-nouvelles"/>
+    <w:bookmarkStart w:id="114" w:name="fonctionnalités-développées-nouvelles"/>
     <w:p>
       <w:pPr>
         <w:pStyle w:val="Heading3"/>
@@ -4094,7 +4589,7 @@
         <w:rPr>
           <w:rStyle w:val="SectionNumber"/>
         </w:rPr>
-        <w:t xml:space="preserve">1.4.1</w:t>
+        <w:t xml:space="preserve">4.1</w:t>
       </w:r>
       <w:r>
         <w:tab/>
@@ -4103,7 +4598,7 @@
         <w:t xml:space="preserve">3.1. Fonctionnalités développées (nouvelles)</w:t>
       </w:r>
     </w:p>
-    <w:bookmarkStart w:id="87" w:name="X028e8eda70314ce78d9230db8492acee229f0f1"/>
+    <w:bookmarkStart w:id="109" w:name="X028e8eda70314ce78d9230db8492acee229f0f1"/>
     <w:p>
       <w:pPr>
         <w:pStyle w:val="Heading4"/>
@@ -4112,7 +4607,7 @@
         <w:rPr>
           <w:rStyle w:val="SectionNumber"/>
         </w:rPr>
-        <w:t xml:space="preserve">1.4.1.1</w:t>
+        <w:t xml:space="preserve">4.1.1</w:t>
       </w:r>
       <w:r>
         <w:tab/>
@@ -4289,8 +4784,8 @@
         <w:t xml:space="preserve">(2 endpoints)</w:t>
       </w:r>
     </w:p>
-    <w:bookmarkEnd w:id="87"/>
-    <w:bookmarkStart w:id="88" w:name="f-02-configuration-flyway-explicite"/>
+    <w:bookmarkEnd w:id="109"/>
+    <w:bookmarkStart w:id="110" w:name="f-02-configuration-flyway-explicite"/>
     <w:p>
       <w:pPr>
         <w:pStyle w:val="Heading4"/>
@@ -4299,7 +4794,7 @@
         <w:rPr>
           <w:rStyle w:val="SectionNumber"/>
         </w:rPr>
-        <w:t xml:space="preserve">1.4.1.2</w:t>
+        <w:t xml:space="preserve">4.1.2</w:t>
       </w:r>
       <w:r>
         <w:tab/>
@@ -4335,8 +4830,8 @@
         <w:t xml:space="preserve">(~60 lignes).</w:t>
       </w:r>
     </w:p>
-    <w:bookmarkEnd w:id="88"/>
-    <w:bookmarkStart w:id="89" w:name="Xa6b5334b6a270291bc36cf756e9a208947cad56"/>
+    <w:bookmarkEnd w:id="110"/>
+    <w:bookmarkStart w:id="111" w:name="Xa6b5334b6a270291bc36cf756e9a208947cad56"/>
     <w:p>
       <w:pPr>
         <w:pStyle w:val="Heading4"/>
@@ -4345,7 +4840,7 @@
         <w:rPr>
           <w:rStyle w:val="SectionNumber"/>
         </w:rPr>
-        <w:t xml:space="preserve">1.4.1.3</w:t>
+        <w:t xml:space="preserve">4.1.3</w:t>
       </w:r>
       <w:r>
         <w:tab/>
@@ -4381,8 +4876,8 @@
         <w:t xml:space="preserve">(~40 lignes).</w:t>
       </w:r>
     </w:p>
-    <w:bookmarkEnd w:id="89"/>
-    <w:bookmarkStart w:id="90" w:name="f-04-infrastructure-docker-complète"/>
+    <w:bookmarkEnd w:id="111"/>
+    <w:bookmarkStart w:id="112" w:name="f-04-infrastructure-docker-complète"/>
     <w:p>
       <w:pPr>
         <w:pStyle w:val="Heading4"/>
@@ -4391,7 +4886,7 @@
         <w:rPr>
           <w:rStyle w:val="SectionNumber"/>
         </w:rPr>
-        <w:t xml:space="preserve">1.4.1.4</w:t>
+        <w:t xml:space="preserve">4.1.4</w:t>
       </w:r>
       <w:r>
         <w:tab/>
@@ -4460,8 +4955,8 @@
         <w:t xml:space="preserve">.</w:t>
       </w:r>
     </w:p>
-    <w:bookmarkEnd w:id="90"/>
-    <w:bookmarkStart w:id="91" w:name="f-05-activation-du-scheduling-spring"/>
+    <w:bookmarkEnd w:id="112"/>
+    <w:bookmarkStart w:id="113" w:name="f-05-activation-du-scheduling-spring"/>
     <w:p>
       <w:pPr>
         <w:pStyle w:val="Heading4"/>
@@ -4470,7 +4965,7 @@
         <w:rPr>
           <w:rStyle w:val="SectionNumber"/>
         </w:rPr>
-        <w:t xml:space="preserve">1.4.1.5</w:t>
+        <w:t xml:space="preserve">4.1.5</w:t>
       </w:r>
       <w:r>
         <w:tab/>
@@ -4512,9 +5007,9 @@
         <w:t xml:space="preserve">).</w:t>
       </w:r>
     </w:p>
-    <w:bookmarkEnd w:id="91"/>
-    <w:bookmarkEnd w:id="92"/>
-    <w:bookmarkStart w:id="93" w:name="fonctionnalités-modifiées"/>
+    <w:bookmarkEnd w:id="113"/>
+    <w:bookmarkEnd w:id="114"/>
+    <w:bookmarkStart w:id="115" w:name="fonctionnalités-modifiées"/>
     <w:p>
       <w:pPr>
         <w:pStyle w:val="Heading3"/>
@@ -4523,7 +5018,7 @@
         <w:rPr>
           <w:rStyle w:val="SectionNumber"/>
         </w:rPr>
-        <w:t xml:space="preserve">1.4.2</w:t>
+        <w:t xml:space="preserve">4.2</w:t>
       </w:r>
       <w:r>
         <w:tab/>
@@ -4796,8 +5291,8 @@
         </w:tc>
       </w:tr>
     </w:tbl>
-    <w:bookmarkEnd w:id="93"/>
-    <w:bookmarkStart w:id="94" w:name="fonctionnalités-testées"/>
+    <w:bookmarkEnd w:id="115"/>
+    <w:bookmarkStart w:id="134" w:name="fonctionnalités-testées"/>
     <w:p>
       <w:pPr>
         <w:pStyle w:val="Heading3"/>
@@ -4806,7 +5301,7 @@
         <w:rPr>
           <w:rStyle w:val="SectionNumber"/>
         </w:rPr>
-        <w:t xml:space="preserve">1.4.3</w:t>
+        <w:t xml:space="preserve">4.3</w:t>
       </w:r>
       <w:r>
         <w:tab/>
@@ -5080,6 +5575,408 @@
     </w:tbl>
     <w:p>
       <w:pPr>
+        <w:pStyle w:val="CaptionedFigure"/>
+      </w:pPr>
+      <w:r>
+        <w:drawing>
+          <wp:inline>
+            <wp:extent cx="5334000" cy="1298995"/>
+            <wp:effectExtent b="0" l="0" r="0" t="0"/>
+            <wp:docPr descr="Test 12 Tenant : NOTICE OK — password_history append-only." title="" id="117" name="Picture"/>
+            <a:graphic>
+              <a:graphicData uri="http://schemas.openxmlformats.org/drawingml/2006/picture">
+                <pic:pic>
+                  <pic:nvPicPr>
+                    <pic:cNvPr descr="/home/idrissa_yameogo/projets/ycognicore-cloud/docs/rapports/captures/10/61-test12-tenant.png" id="118" name="Picture"/>
+                    <pic:cNvPicPr>
+                      <a:picLocks noChangeArrowheads="1" noChangeAspect="1"/>
+                    </pic:cNvPicPr>
+                  </pic:nvPicPr>
+                  <pic:blipFill>
+                    <a:blip r:embed="rId116"/>
+                    <a:stretch>
+                      <a:fillRect/>
+                    </a:stretch>
+                  </pic:blipFill>
+                  <pic:spPr bwMode="auto">
+                    <a:xfrm>
+                      <a:off x="0" y="0"/>
+                      <a:ext cx="5334000" cy="1298995"/>
+                    </a:xfrm>
+                    <a:prstGeom prst="rect">
+                      <a:avLst/>
+                    </a:prstGeom>
+                    <a:noFill/>
+                    <a:ln w="9525">
+                      <a:noFill/>
+                      <a:headEnd/>
+                      <a:tailEnd/>
+                    </a:ln>
+                  </pic:spPr>
+                </pic:pic>
+              </a:graphicData>
+            </a:graphic>
+          </wp:inline>
+        </w:drawing>
+      </w:r>
+    </w:p>
+    <w:p>
+      <w:pPr>
+        <w:pStyle w:val="ImageCaption"/>
+      </w:pPr>
+      <w:r>
+        <w:t xml:space="preserve">Test 12 Tenant : NOTICE OK — password_history append-only.</w:t>
+      </w:r>
+    </w:p>
+    <w:p>
+      <w:pPr>
+        <w:pStyle w:val="BodyText"/>
+      </w:pPr>
+      <w:r>
+        <w:rPr>
+          <w:i/>
+          <w:iCs/>
+        </w:rPr>
+        <w:t xml:space="preserve">Test 12 Tenant : NOTICE OK — password_history append-only.</w:t>
+      </w:r>
+    </w:p>
+    <w:p>
+      <w:pPr>
+        <w:pStyle w:val="CaptionedFigure"/>
+      </w:pPr>
+      <w:r>
+        <w:drawing>
+          <wp:inline>
+            <wp:extent cx="5334000" cy="1066800"/>
+            <wp:effectExtent b="0" l="0" r="0" t="0"/>
+            <wp:docPr descr="Test 10 Tenant : NOTICE OK — VERROUILLE après 5 échecs." title="" id="120" name="Picture"/>
+            <a:graphic>
+              <a:graphicData uri="http://schemas.openxmlformats.org/drawingml/2006/picture">
+                <pic:pic>
+                  <pic:nvPicPr>
+                    <pic:cNvPr descr="/home/idrissa_yameogo/projets/ycognicore-cloud/docs/rapports/captures/10/60-test10-tenant.png" id="121" name="Picture"/>
+                    <pic:cNvPicPr>
+                      <a:picLocks noChangeArrowheads="1" noChangeAspect="1"/>
+                    </pic:cNvPicPr>
+                  </pic:nvPicPr>
+                  <pic:blipFill>
+                    <a:blip r:embed="rId119"/>
+                    <a:stretch>
+                      <a:fillRect/>
+                    </a:stretch>
+                  </pic:blipFill>
+                  <pic:spPr bwMode="auto">
+                    <a:xfrm>
+                      <a:off x="0" y="0"/>
+                      <a:ext cx="5334000" cy="1066800"/>
+                    </a:xfrm>
+                    <a:prstGeom prst="rect">
+                      <a:avLst/>
+                    </a:prstGeom>
+                    <a:noFill/>
+                    <a:ln w="9525">
+                      <a:noFill/>
+                      <a:headEnd/>
+                      <a:tailEnd/>
+                    </a:ln>
+                  </pic:spPr>
+                </pic:pic>
+              </a:graphicData>
+            </a:graphic>
+          </wp:inline>
+        </w:drawing>
+      </w:r>
+    </w:p>
+    <w:p>
+      <w:pPr>
+        <w:pStyle w:val="ImageCaption"/>
+      </w:pPr>
+      <w:r>
+        <w:t xml:space="preserve">Test 10 Tenant : NOTICE OK — VERROUILLE après 5 échecs.</w:t>
+      </w:r>
+    </w:p>
+    <w:p>
+      <w:pPr>
+        <w:pStyle w:val="BodyText"/>
+      </w:pPr>
+      <w:r>
+        <w:rPr>
+          <w:i/>
+          <w:iCs/>
+        </w:rPr>
+        <w:t xml:space="preserve">Test 10 Tenant : NOTICE OK — VERROUILLE après 5 échecs.</w:t>
+      </w:r>
+    </w:p>
+    <w:p>
+      <w:pPr>
+        <w:pStyle w:val="CaptionedFigure"/>
+      </w:pPr>
+      <w:r>
+        <w:drawing>
+          <wp:inline>
+            <wp:extent cx="5334000" cy="1010652"/>
+            <wp:effectExtent b="0" l="0" r="0" t="0"/>
+            <wp:docPr descr="Test 6 CP : 6 fonctions critiques créées." title="" id="123" name="Picture"/>
+            <a:graphic>
+              <a:graphicData uri="http://schemas.openxmlformats.org/drawingml/2006/picture">
+                <pic:pic>
+                  <pic:nvPicPr>
+                    <pic:cNvPr descr="/home/idrissa_yameogo/projets/ycognicore-cloud/docs/rapports/captures/10/55-test6-cp.png" id="124" name="Picture"/>
+                    <pic:cNvPicPr>
+                      <a:picLocks noChangeArrowheads="1" noChangeAspect="1"/>
+                    </pic:cNvPicPr>
+                  </pic:nvPicPr>
+                  <pic:blipFill>
+                    <a:blip r:embed="rId122"/>
+                    <a:stretch>
+                      <a:fillRect/>
+                    </a:stretch>
+                  </pic:blipFill>
+                  <pic:spPr bwMode="auto">
+                    <a:xfrm>
+                      <a:off x="0" y="0"/>
+                      <a:ext cx="5334000" cy="1010652"/>
+                    </a:xfrm>
+                    <a:prstGeom prst="rect">
+                      <a:avLst/>
+                    </a:prstGeom>
+                    <a:noFill/>
+                    <a:ln w="9525">
+                      <a:noFill/>
+                      <a:headEnd/>
+                      <a:tailEnd/>
+                    </a:ln>
+                  </pic:spPr>
+                </pic:pic>
+              </a:graphicData>
+            </a:graphic>
+          </wp:inline>
+        </w:drawing>
+      </w:r>
+    </w:p>
+    <w:p>
+      <w:pPr>
+        <w:pStyle w:val="ImageCaption"/>
+      </w:pPr>
+      <w:r>
+        <w:t xml:space="preserve">Test 6 CP : 6 fonctions critiques créées.</w:t>
+      </w:r>
+    </w:p>
+    <w:p>
+      <w:pPr>
+        <w:pStyle w:val="BodyText"/>
+      </w:pPr>
+      <w:r>
+        <w:rPr>
+          <w:i/>
+          <w:iCs/>
+        </w:rPr>
+        <w:t xml:space="preserve">Test 6 CP : 6 fonctions critiques créées.</w:t>
+      </w:r>
+    </w:p>
+    <w:p>
+      <w:pPr>
+        <w:pStyle w:val="CaptionedFigure"/>
+      </w:pPr>
+      <w:r>
+        <w:drawing>
+          <wp:inline>
+            <wp:extent cx="5334000" cy="1179094"/>
+            <wp:effectExtent b="0" l="0" r="0" t="0"/>
+            <wp:docPr descr="Test 5 CP : 6 triggers d’immuabilité actifs." title="" id="126" name="Picture"/>
+            <a:graphic>
+              <a:graphicData uri="http://schemas.openxmlformats.org/drawingml/2006/picture">
+                <pic:pic>
+                  <pic:nvPicPr>
+                    <pic:cNvPr descr="/home/idrissa_yameogo/projets/ycognicore-cloud/docs/rapports/captures/10/54-test5-cp.png" id="127" name="Picture"/>
+                    <pic:cNvPicPr>
+                      <a:picLocks noChangeArrowheads="1" noChangeAspect="1"/>
+                    </pic:cNvPicPr>
+                  </pic:nvPicPr>
+                  <pic:blipFill>
+                    <a:blip r:embed="rId125"/>
+                    <a:stretch>
+                      <a:fillRect/>
+                    </a:stretch>
+                  </pic:blipFill>
+                  <pic:spPr bwMode="auto">
+                    <a:xfrm>
+                      <a:off x="0" y="0"/>
+                      <a:ext cx="5334000" cy="1179094"/>
+                    </a:xfrm>
+                    <a:prstGeom prst="rect">
+                      <a:avLst/>
+                    </a:prstGeom>
+                    <a:noFill/>
+                    <a:ln w="9525">
+                      <a:noFill/>
+                      <a:headEnd/>
+                      <a:tailEnd/>
+                    </a:ln>
+                  </pic:spPr>
+                </pic:pic>
+              </a:graphicData>
+            </a:graphic>
+          </wp:inline>
+        </w:drawing>
+      </w:r>
+    </w:p>
+    <w:p>
+      <w:pPr>
+        <w:pStyle w:val="ImageCaption"/>
+      </w:pPr>
+      <w:r>
+        <w:t xml:space="preserve">Test 5 CP : 6 triggers d’immuabilité actifs.</w:t>
+      </w:r>
+    </w:p>
+    <w:p>
+      <w:pPr>
+        <w:pStyle w:val="BodyText"/>
+      </w:pPr>
+      <w:r>
+        <w:rPr>
+          <w:i/>
+          <w:iCs/>
+        </w:rPr>
+        <w:t xml:space="preserve">Test 5 CP : 6 triggers d’immuabilité actifs.</w:t>
+      </w:r>
+    </w:p>
+    <w:p>
+      <w:pPr>
+        <w:pStyle w:val="CaptionedFigure"/>
+      </w:pPr>
+      <w:r>
+        <w:drawing>
+          <wp:inline>
+            <wp:extent cx="5334000" cy="1122947"/>
+            <wp:effectExtent b="0" l="0" r="0" t="0"/>
+            <wp:docPr descr="Test 4 CP : 11 colonnes critiques vérifiées." title="" id="129" name="Picture"/>
+            <a:graphic>
+              <a:graphicData uri="http://schemas.openxmlformats.org/drawingml/2006/picture">
+                <pic:pic>
+                  <pic:nvPicPr>
+                    <pic:cNvPr descr="/home/idrissa_yameogo/projets/ycognicore-cloud/docs/rapports/captures/10/53-test4-cp.png" id="130" name="Picture"/>
+                    <pic:cNvPicPr>
+                      <a:picLocks noChangeArrowheads="1" noChangeAspect="1"/>
+                    </pic:cNvPicPr>
+                  </pic:nvPicPr>
+                  <pic:blipFill>
+                    <a:blip r:embed="rId128"/>
+                    <a:stretch>
+                      <a:fillRect/>
+                    </a:stretch>
+                  </pic:blipFill>
+                  <pic:spPr bwMode="auto">
+                    <a:xfrm>
+                      <a:off x="0" y="0"/>
+                      <a:ext cx="5334000" cy="1122947"/>
+                    </a:xfrm>
+                    <a:prstGeom prst="rect">
+                      <a:avLst/>
+                    </a:prstGeom>
+                    <a:noFill/>
+                    <a:ln w="9525">
+                      <a:noFill/>
+                      <a:headEnd/>
+                      <a:tailEnd/>
+                    </a:ln>
+                  </pic:spPr>
+                </pic:pic>
+              </a:graphicData>
+            </a:graphic>
+          </wp:inline>
+        </w:drawing>
+      </w:r>
+    </w:p>
+    <w:p>
+      <w:pPr>
+        <w:pStyle w:val="ImageCaption"/>
+      </w:pPr>
+      <w:r>
+        <w:t xml:space="preserve">Test 4 CP : 11 colonnes critiques vérifiées.</w:t>
+      </w:r>
+    </w:p>
+    <w:p>
+      <w:pPr>
+        <w:pStyle w:val="BodyText"/>
+      </w:pPr>
+      <w:r>
+        <w:rPr>
+          <w:i/>
+          <w:iCs/>
+        </w:rPr>
+        <w:t xml:space="preserve">Test 4 CP : 11 colonnes critiques vérifiées.</w:t>
+      </w:r>
+    </w:p>
+    <w:p>
+      <w:pPr>
+        <w:pStyle w:val="CaptionedFigure"/>
+      </w:pPr>
+      <w:r>
+        <w:drawing>
+          <wp:inline>
+            <wp:extent cx="5334000" cy="842210"/>
+            <wp:effectExtent b="0" l="0" r="0" t="0"/>
+            <wp:docPr descr="Test 3 CP : 0 table manquante (toutes présentes)." title="" id="132" name="Picture"/>
+            <a:graphic>
+              <a:graphicData uri="http://schemas.openxmlformats.org/drawingml/2006/picture">
+                <pic:pic>
+                  <pic:nvPicPr>
+                    <pic:cNvPr descr="/home/idrissa_yameogo/projets/ycognicore-cloud/docs/rapports/captures/10/52-test3-cp.png" id="133" name="Picture"/>
+                    <pic:cNvPicPr>
+                      <a:picLocks noChangeArrowheads="1" noChangeAspect="1"/>
+                    </pic:cNvPicPr>
+                  </pic:nvPicPr>
+                  <pic:blipFill>
+                    <a:blip r:embed="rId131"/>
+                    <a:stretch>
+                      <a:fillRect/>
+                    </a:stretch>
+                  </pic:blipFill>
+                  <pic:spPr bwMode="auto">
+                    <a:xfrm>
+                      <a:off x="0" y="0"/>
+                      <a:ext cx="5334000" cy="842210"/>
+                    </a:xfrm>
+                    <a:prstGeom prst="rect">
+                      <a:avLst/>
+                    </a:prstGeom>
+                    <a:noFill/>
+                    <a:ln w="9525">
+                      <a:noFill/>
+                      <a:headEnd/>
+                      <a:tailEnd/>
+                    </a:ln>
+                  </pic:spPr>
+                </pic:pic>
+              </a:graphicData>
+            </a:graphic>
+          </wp:inline>
+        </w:drawing>
+      </w:r>
+    </w:p>
+    <w:p>
+      <w:pPr>
+        <w:pStyle w:val="ImageCaption"/>
+      </w:pPr>
+      <w:r>
+        <w:t xml:space="preserve">Test 3 CP : 0 table manquante (toutes présentes).</w:t>
+      </w:r>
+    </w:p>
+    <w:p>
+      <w:pPr>
+        <w:pStyle w:val="BodyText"/>
+      </w:pPr>
+      <w:r>
+        <w:rPr>
+          <w:i/>
+          <w:iCs/>
+        </w:rPr>
+        <w:t xml:space="preserve">Test 3 CP : 0 table manquante (toutes présentes).</w:t>
+      </w:r>
+    </w:p>
+    <w:p>
+      <w:pPr>
         <w:pStyle w:val="BodyText"/>
       </w:pPr>
       <w:r>
@@ -5109,9 +6006,9 @@
         </w:pict>
       </w:r>
     </w:p>
-    <w:bookmarkEnd w:id="94"/>
-    <w:bookmarkEnd w:id="95"/>
-    <w:bookmarkStart w:id="100" w:name="modélisation-des-données-et-architecture"/>
+    <w:bookmarkEnd w:id="134"/>
+    <w:bookmarkEnd w:id="135"/>
+    <w:bookmarkStart w:id="140" w:name="modélisation-des-données-et-architecture"/>
     <w:p>
       <w:pPr>
         <w:pStyle w:val="Heading2"/>
@@ -5120,7 +6017,7 @@
         <w:rPr>
           <w:rStyle w:val="SectionNumber"/>
         </w:rPr>
-        <w:t xml:space="preserve">1.5</w:t>
+        <w:t xml:space="preserve">5</w:t>
       </w:r>
       <w:r>
         <w:tab/>
@@ -5129,7 +6026,7 @@
         <w:t xml:space="preserve">4. Modélisation des données et architecture</w:t>
       </w:r>
     </w:p>
-    <w:bookmarkStart w:id="96" w:name="X23c8fde4ec4edca3e029116b186b9f96399fb97"/>
+    <w:bookmarkStart w:id="136" w:name="X23c8fde4ec4edca3e029116b186b9f96399fb97"/>
     <w:p>
       <w:pPr>
         <w:pStyle w:val="Heading3"/>
@@ -5138,7 +6035,7 @@
         <w:rPr>
           <w:rStyle w:val="SectionNumber"/>
         </w:rPr>
-        <w:t xml:space="preserve">1.5.1</w:t>
+        <w:t xml:space="preserve">5.1</w:t>
       </w:r>
       <w:r>
         <w:tab/>
@@ -5482,8 +6379,8 @@
         </w:tc>
       </w:tr>
     </w:tbl>
-    <w:bookmarkEnd w:id="96"/>
-    <w:bookmarkStart w:id="97" w:name="schéma-tenant-14-tables-8-partitions"/>
+    <w:bookmarkEnd w:id="136"/>
+    <w:bookmarkStart w:id="137" w:name="schéma-tenant-14-tables-8-partitions"/>
     <w:p>
       <w:pPr>
         <w:pStyle w:val="Heading3"/>
@@ -5492,7 +6389,7 @@
         <w:rPr>
           <w:rStyle w:val="SectionNumber"/>
         </w:rPr>
-        <w:t xml:space="preserve">1.5.2</w:t>
+        <w:t xml:space="preserve">5.2</w:t>
       </w:r>
       <w:r>
         <w:tab/>
@@ -5836,8 +6733,8 @@
         </w:tc>
       </w:tr>
     </w:tbl>
-    <w:bookmarkEnd w:id="97"/>
-    <w:bookmarkStart w:id="98" w:name="architecture-docker"/>
+    <w:bookmarkEnd w:id="137"/>
+    <w:bookmarkStart w:id="138" w:name="architecture-docker"/>
     <w:p>
       <w:pPr>
         <w:pStyle w:val="Heading3"/>
@@ -5846,7 +6743,7 @@
         <w:rPr>
           <w:rStyle w:val="SectionNumber"/>
         </w:rPr>
-        <w:t xml:space="preserve">1.5.3</w:t>
+        <w:t xml:space="preserve">5.3</w:t>
       </w:r>
       <w:r>
         <w:tab/>
@@ -5863,8 +6760,8 @@
         <w:t xml:space="preserve">4 services orchestrés : PostgreSQL 16, Redis 7-alpine, Vault 1.17.6, MinIO (pgsty).</w:t>
       </w:r>
     </w:p>
-    <w:bookmarkEnd w:id="98"/>
-    <w:bookmarkStart w:id="99" w:name="architecture-spring-boot"/>
+    <w:bookmarkEnd w:id="138"/>
+    <w:bookmarkStart w:id="139" w:name="architecture-spring-boot"/>
     <w:p>
       <w:pPr>
         <w:pStyle w:val="Heading3"/>
@@ -5873,7 +6770,7 @@
         <w:rPr>
           <w:rStyle w:val="SectionNumber"/>
         </w:rPr>
-        <w:t xml:space="preserve">1.5.4</w:t>
+        <w:t xml:space="preserve">5.4</w:t>
       </w:r>
       <w:r>
         <w:tab/>
@@ -5897,9 +6794,9 @@
         </w:pict>
       </w:r>
     </w:p>
-    <w:bookmarkEnd w:id="99"/>
-    <w:bookmarkEnd w:id="100"/>
-    <w:bookmarkStart w:id="112" w:name="résolution-de-problèmes-détaillée"/>
+    <w:bookmarkEnd w:id="139"/>
+    <w:bookmarkEnd w:id="140"/>
+    <w:bookmarkStart w:id="155" w:name="résolution-de-problèmes-détaillée"/>
     <w:p>
       <w:pPr>
         <w:pStyle w:val="Heading2"/>
@@ -5908,7 +6805,7 @@
         <w:rPr>
           <w:rStyle w:val="SectionNumber"/>
         </w:rPr>
-        <w:t xml:space="preserve">1.6</w:t>
+        <w:t xml:space="preserve">6</w:t>
       </w:r>
       <w:r>
         <w:tab/>
@@ -5929,7 +6826,7 @@
         <w:t xml:space="preserve">11 problèmes rencontrés et résolus au cours de la journée.</w:t>
       </w:r>
     </w:p>
-    <w:bookmarkStart w:id="101" w:name="Xc3ad0c681f250d4f3d04f000e891a07ca78ddac"/>
+    <w:bookmarkStart w:id="141" w:name="Xc3ad0c681f250d4f3d04f000e891a07ca78ddac"/>
     <w:p>
       <w:pPr>
         <w:pStyle w:val="Heading3"/>
@@ -5938,7 +6835,7 @@
         <w:rPr>
           <w:rStyle w:val="SectionNumber"/>
         </w:rPr>
-        <w:t xml:space="preserve">1.6.1</w:t>
+        <w:t xml:space="preserve">6.1</w:t>
       </w:r>
       <w:r>
         <w:tab/>
@@ -5977,8 +6874,8 @@
         <w:t xml:space="preserve">.</w:t>
       </w:r>
     </w:p>
-    <w:bookmarkEnd w:id="101"/>
-    <w:bookmarkStart w:id="102" w:name="problème-2-flyway-ne-sexécute-pas-boot-4"/>
+    <w:bookmarkEnd w:id="141"/>
+    <w:bookmarkStart w:id="142" w:name="problème-2-flyway-ne-sexécute-pas-boot-4"/>
     <w:p>
       <w:pPr>
         <w:pStyle w:val="Heading3"/>
@@ -5987,7 +6884,7 @@
         <w:rPr>
           <w:rStyle w:val="SectionNumber"/>
         </w:rPr>
-        <w:t xml:space="preserve">1.6.2</w:t>
+        <w:t xml:space="preserve">6.2</w:t>
       </w:r>
       <w:r>
         <w:tab/>
@@ -6029,8 +6926,8 @@
         <w:t xml:space="preserve">explicite.</w:t>
       </w:r>
     </w:p>
-    <w:bookmarkEnd w:id="102"/>
-    <w:bookmarkStart w:id="103" w:name="X1ac4f147704a9ce9cf792dc40b0939b9e353941"/>
+    <w:bookmarkEnd w:id="142"/>
+    <w:bookmarkStart w:id="146" w:name="X1ac4f147704a9ce9cf792dc40b0939b9e353941"/>
     <w:p>
       <w:pPr>
         <w:pStyle w:val="Heading3"/>
@@ -6039,7 +6936,7 @@
         <w:rPr>
           <w:rStyle w:val="SectionNumber"/>
         </w:rPr>
-        <w:t xml:space="preserve">1.6.3</w:t>
+        <w:t xml:space="preserve">6.3</w:t>
       </w:r>
       <w:r>
         <w:tab/>
@@ -6063,11 +6960,84 @@
         <w:t xml:space="preserve"> </w:t>
       </w:r>
       <w:r>
-        <w:t xml:space="preserve">drop + recreate de la base.</w:t>
-      </w:r>
-    </w:p>
-    <w:bookmarkEnd w:id="103"/>
-    <w:bookmarkStart w:id="104" w:name="problème-4-endpoint-401-unauthorized"/>
+        <w:t xml:space="preserve">drop + recreate de la base</w:t>
+      </w:r>
+    </w:p>
+    <w:p>
+      <w:pPr>
+        <w:pStyle w:val="CaptionedFigure"/>
+      </w:pPr>
+      <w:r>
+        <w:drawing>
+          <wp:inline>
+            <wp:extent cx="5334000" cy="3017570"/>
+            <wp:effectExtent b="0" l="0" r="0" t="0"/>
+            <wp:docPr descr="Structure partition_maintenance_log" title="" id="144" name="Picture"/>
+            <a:graphic>
+              <a:graphicData uri="http://schemas.openxmlformats.org/drawingml/2006/picture">
+                <pic:pic>
+                  <pic:nvPicPr>
+                    <pic:cNvPr descr="/home/idrissa_yameogo/projets/ycognicore-cloud/docs/rapports/captures/10/24-partition-table.png" id="145" name="Picture"/>
+                    <pic:cNvPicPr>
+                      <a:picLocks noChangeArrowheads="1" noChangeAspect="1"/>
+                    </pic:cNvPicPr>
+                  </pic:nvPicPr>
+                  <pic:blipFill>
+                    <a:blip r:embed="rId143"/>
+                    <a:stretch>
+                      <a:fillRect/>
+                    </a:stretch>
+                  </pic:blipFill>
+                  <pic:spPr bwMode="auto">
+                    <a:xfrm>
+                      <a:off x="0" y="0"/>
+                      <a:ext cx="5334000" cy="3017570"/>
+                    </a:xfrm>
+                    <a:prstGeom prst="rect">
+                      <a:avLst/>
+                    </a:prstGeom>
+                    <a:noFill/>
+                    <a:ln w="9525">
+                      <a:noFill/>
+                      <a:headEnd/>
+                      <a:tailEnd/>
+                    </a:ln>
+                  </pic:spPr>
+                </pic:pic>
+              </a:graphicData>
+            </a:graphic>
+          </wp:inline>
+        </w:drawing>
+      </w:r>
+    </w:p>
+    <w:p>
+      <w:pPr>
+        <w:pStyle w:val="ImageCaption"/>
+      </w:pPr>
+      <w:r>
+        <w:t xml:space="preserve">Structure partition_maintenance_log</w:t>
+      </w:r>
+    </w:p>
+    <w:p>
+      <w:pPr>
+        <w:pStyle w:val="BodyText"/>
+      </w:pPr>
+      <w:r>
+        <w:rPr>
+          <w:i/>
+          <w:iCs/>
+        </w:rPr>
+        <w:t xml:space="preserve">Figure — Structure de la table partition_maintenance_log.</w:t>
+      </w:r>
+      <w:r>
+        <w:t xml:space="preserve"> </w:t>
+      </w:r>
+      <w:r>
+        <w:t xml:space="preserve">.</w:t>
+      </w:r>
+    </w:p>
+    <w:bookmarkEnd w:id="146"/>
+    <w:bookmarkStart w:id="147" w:name="problème-4-endpoint-401-unauthorized"/>
     <w:p>
       <w:pPr>
         <w:pStyle w:val="Heading3"/>
@@ -6076,7 +7046,7 @@
         <w:rPr>
           <w:rStyle w:val="SectionNumber"/>
         </w:rPr>
-        <w:t xml:space="preserve">1.6.4</w:t>
+        <w:t xml:space="preserve">6.4</w:t>
       </w:r>
       <w:r>
         <w:tab/>
@@ -6109,8 +7079,8 @@
         <w:t xml:space="preserve">.</w:t>
       </w:r>
     </w:p>
-    <w:bookmarkEnd w:id="104"/>
-    <w:bookmarkStart w:id="105" w:name="problème-5-0-tenants-détectés"/>
+    <w:bookmarkEnd w:id="147"/>
+    <w:bookmarkStart w:id="148" w:name="problème-5-0-tenants-détectés"/>
     <w:p>
       <w:pPr>
         <w:pStyle w:val="Heading3"/>
@@ -6119,7 +7089,7 @@
         <w:rPr>
           <w:rStyle w:val="SectionNumber"/>
         </w:rPr>
-        <w:t xml:space="preserve">1.6.5</w:t>
+        <w:t xml:space="preserve">6.5</w:t>
       </w:r>
       <w:r>
         <w:tab/>
@@ -6158,8 +7128,8 @@
         <w:t xml:space="preserve">.</w:t>
       </w:r>
     </w:p>
-    <w:bookmarkEnd w:id="105"/>
-    <w:bookmarkStart w:id="106" w:name="problème-6-12-erreurs-password"/>
+    <w:bookmarkEnd w:id="148"/>
+    <w:bookmarkStart w:id="149" w:name="problème-6-12-erreurs-password"/>
     <w:p>
       <w:pPr>
         <w:pStyle w:val="Heading3"/>
@@ -6168,7 +7138,7 @@
         <w:rPr>
           <w:rStyle w:val="SectionNumber"/>
         </w:rPr>
-        <w:t xml:space="preserve">1.6.6</w:t>
+        <w:t xml:space="preserve">6.6</w:t>
       </w:r>
       <w:r>
         <w:tab/>
@@ -6201,8 +7171,8 @@
         <w:t xml:space="preserve">.</w:t>
       </w:r>
     </w:p>
-    <w:bookmarkEnd w:id="106"/>
-    <w:bookmarkStart w:id="107" w:name="problème-7-ddl-create-interdit"/>
+    <w:bookmarkEnd w:id="149"/>
+    <w:bookmarkStart w:id="150" w:name="problème-7-ddl-create-interdit"/>
     <w:p>
       <w:pPr>
         <w:pStyle w:val="Heading3"/>
@@ -6211,7 +7181,7 @@
         <w:rPr>
           <w:rStyle w:val="SectionNumber"/>
         </w:rPr>
-        <w:t xml:space="preserve">1.6.7</w:t>
+        <w:t xml:space="preserve">6.7</w:t>
       </w:r>
       <w:r>
         <w:tab/>
@@ -6250,8 +7220,8 @@
         <w:t xml:space="preserve">.</w:t>
       </w:r>
     </w:p>
-    <w:bookmarkEnd w:id="107"/>
-    <w:bookmarkStart w:id="108" w:name="problème-8-image-minio-retirée"/>
+    <w:bookmarkEnd w:id="150"/>
+    <w:bookmarkStart w:id="151" w:name="problème-8-image-minio-retirée"/>
     <w:p>
       <w:pPr>
         <w:pStyle w:val="Heading3"/>
@@ -6260,7 +7230,7 @@
         <w:rPr>
           <w:rStyle w:val="SectionNumber"/>
         </w:rPr>
-        <w:t xml:space="preserve">1.6.8</w:t>
+        <w:t xml:space="preserve">6.8</w:t>
       </w:r>
       <w:r>
         <w:tab/>
@@ -6293,8 +7263,8 @@
         <w:t xml:space="preserve">.</w:t>
       </w:r>
     </w:p>
-    <w:bookmarkEnd w:id="108"/>
-    <w:bookmarkStart w:id="109" w:name="problème-9-healthcheck-vault-ipv6"/>
+    <w:bookmarkEnd w:id="151"/>
+    <w:bookmarkStart w:id="152" w:name="problème-9-healthcheck-vault-ipv6"/>
     <w:p>
       <w:pPr>
         <w:pStyle w:val="Heading3"/>
@@ -6303,7 +7273,7 @@
         <w:rPr>
           <w:rStyle w:val="SectionNumber"/>
         </w:rPr>
-        <w:t xml:space="preserve">1.6.9</w:t>
+        <w:t xml:space="preserve">6.9</w:t>
       </w:r>
       <w:r>
         <w:tab/>
@@ -6336,8 +7306,8 @@
         <w:t xml:space="preserve">.</w:t>
       </w:r>
     </w:p>
-    <w:bookmarkEnd w:id="109"/>
-    <w:bookmarkStart w:id="110" w:name="problème-10-boto3-absent"/>
+    <w:bookmarkEnd w:id="152"/>
+    <w:bookmarkStart w:id="153" w:name="problème-10-boto3-absent"/>
     <w:p>
       <w:pPr>
         <w:pStyle w:val="Heading3"/>
@@ -6346,7 +7316,7 @@
         <w:rPr>
           <w:rStyle w:val="SectionNumber"/>
         </w:rPr>
-        <w:t xml:space="preserve">1.6.10</w:t>
+        <w:t xml:space="preserve">6.10</w:t>
       </w:r>
       <w:r>
         <w:tab/>
@@ -6388,8 +7358,8 @@
         <w:t xml:space="preserve">éphémère.</w:t>
       </w:r>
     </w:p>
-    <w:bookmarkEnd w:id="110"/>
-    <w:bookmarkStart w:id="111" w:name="problème-11-mc-non-téléchargeable"/>
+    <w:bookmarkEnd w:id="153"/>
+    <w:bookmarkStart w:id="154" w:name="problème-11-mc-non-téléchargeable"/>
     <w:p>
       <w:pPr>
         <w:pStyle w:val="Heading3"/>
@@ -6398,7 +7368,7 @@
         <w:rPr>
           <w:rStyle w:val="SectionNumber"/>
         </w:rPr>
-        <w:t xml:space="preserve">1.6.11</w:t>
+        <w:t xml:space="preserve">6.11</w:t>
       </w:r>
       <w:r>
         <w:tab/>
@@ -6432,9 +7402,9 @@
         </w:pict>
       </w:r>
     </w:p>
-    <w:bookmarkEnd w:id="111"/>
-    <w:bookmarkEnd w:id="112"/>
-    <w:bookmarkStart w:id="115" w:name="résultats-obtenus"/>
+    <w:bookmarkEnd w:id="154"/>
+    <w:bookmarkEnd w:id="155"/>
+    <w:bookmarkStart w:id="158" w:name="résultats-obtenus"/>
     <w:p>
       <w:pPr>
         <w:pStyle w:val="Heading2"/>
@@ -6443,7 +7413,7 @@
         <w:rPr>
           <w:rStyle w:val="SectionNumber"/>
         </w:rPr>
-        <w:t xml:space="preserve">1.7</w:t>
+        <w:t xml:space="preserve">7</w:t>
       </w:r>
       <w:r>
         <w:tab/>
@@ -6452,7 +7422,7 @@
         <w:t xml:space="preserve">6. Résultats obtenus</w:t>
       </w:r>
     </w:p>
-    <w:bookmarkStart w:id="113" w:name="livrables-produits"/>
+    <w:bookmarkStart w:id="156" w:name="livrables-produits"/>
     <w:p>
       <w:pPr>
         <w:pStyle w:val="Heading3"/>
@@ -6461,7 +7431,7 @@
         <w:rPr>
           <w:rStyle w:val="SectionNumber"/>
         </w:rPr>
-        <w:t xml:space="preserve">1.7.1</w:t>
+        <w:t xml:space="preserve">7.1</w:t>
       </w:r>
       <w:r>
         <w:tab/>
@@ -6828,8 +7798,8 @@
         </w:tc>
       </w:tr>
     </w:tbl>
-    <w:bookmarkEnd w:id="113"/>
-    <w:bookmarkStart w:id="114" w:name="statistiques-de-la-journée"/>
+    <w:bookmarkEnd w:id="156"/>
+    <w:bookmarkStart w:id="157" w:name="statistiques-de-la-journée"/>
     <w:p>
       <w:pPr>
         <w:pStyle w:val="Heading3"/>
@@ -6838,7 +7808,7 @@
         <w:rPr>
           <w:rStyle w:val="SectionNumber"/>
         </w:rPr>
-        <w:t xml:space="preserve">1.7.2</w:t>
+        <w:t xml:space="preserve">7.2</w:t>
       </w:r>
       <w:r>
         <w:tab/>
@@ -7084,9 +8054,9 @@
         </w:pict>
       </w:r>
     </w:p>
-    <w:bookmarkEnd w:id="114"/>
-    <w:bookmarkEnd w:id="115"/>
-    <w:bookmarkStart w:id="120" w:name="bilan-et-prochaines-étapes"/>
+    <w:bookmarkEnd w:id="157"/>
+    <w:bookmarkEnd w:id="158"/>
+    <w:bookmarkStart w:id="163" w:name="bilan-et-prochaines-étapes"/>
     <w:p>
       <w:pPr>
         <w:pStyle w:val="Heading2"/>
@@ -7095,7 +8065,7 @@
         <w:rPr>
           <w:rStyle w:val="SectionNumber"/>
         </w:rPr>
-        <w:t xml:space="preserve">1.8</w:t>
+        <w:t xml:space="preserve">8</w:t>
       </w:r>
       <w:r>
         <w:tab/>
@@ -7104,7 +8074,7 @@
         <w:t xml:space="preserve">7. Bilan et prochaines étapes</w:t>
       </w:r>
     </w:p>
-    <w:bookmarkStart w:id="116" w:name="sprint-h0-clôturé-66"/>
+    <w:bookmarkStart w:id="159" w:name="sprint-h0-clôturé-66"/>
     <w:p>
       <w:pPr>
         <w:pStyle w:val="Heading3"/>
@@ -7113,7 +8083,7 @@
         <w:rPr>
           <w:rStyle w:val="SectionNumber"/>
         </w:rPr>
-        <w:t xml:space="preserve">1.8.1</w:t>
+        <w:t xml:space="preserve">8.1</w:t>
       </w:r>
       <w:r>
         <w:tab/>
@@ -7382,8 +8352,8 @@
         </w:tc>
       </w:tr>
     </w:tbl>
-    <w:bookmarkEnd w:id="116"/>
-    <w:bookmarkStart w:id="117" w:name="avancement-global-phase-1"/>
+    <w:bookmarkEnd w:id="159"/>
+    <w:bookmarkStart w:id="160" w:name="avancement-global-phase-1"/>
     <w:p>
       <w:pPr>
         <w:pStyle w:val="Heading3"/>
@@ -7392,7 +8362,7 @@
         <w:rPr>
           <w:rStyle w:val="SectionNumber"/>
         </w:rPr>
-        <w:t xml:space="preserve">1.8.2</w:t>
+        <w:t xml:space="preserve">8.2</w:t>
       </w:r>
       <w:r>
         <w:tab/>
@@ -7654,8 +8624,8 @@
         </w:tc>
       </w:tr>
     </w:tbl>
-    <w:bookmarkEnd w:id="117"/>
-    <w:bookmarkStart w:id="118" w:name="reste-à-faire"/>
+    <w:bookmarkEnd w:id="160"/>
+    <w:bookmarkStart w:id="161" w:name="reste-à-faire"/>
     <w:p>
       <w:pPr>
         <w:pStyle w:val="Heading3"/>
@@ -7664,7 +8634,7 @@
         <w:rPr>
           <w:rStyle w:val="SectionNumber"/>
         </w:rPr>
-        <w:t xml:space="preserve">1.8.3</w:t>
+        <w:t xml:space="preserve">8.3</w:t>
       </w:r>
       <w:r>
         <w:tab/>
@@ -8015,8 +8985,8 @@
         </w:tc>
       </w:tr>
     </w:tbl>
-    <w:bookmarkEnd w:id="118"/>
-    <w:bookmarkStart w:id="119" w:name="conformité-aux-directives-du-29092026"/>
+    <w:bookmarkEnd w:id="161"/>
+    <w:bookmarkStart w:id="162" w:name="conformité-aux-directives-du-29092026"/>
     <w:p>
       <w:pPr>
         <w:pStyle w:val="Heading3"/>
@@ -8025,7 +8995,7 @@
         <w:rPr>
           <w:rStyle w:val="SectionNumber"/>
         </w:rPr>
-        <w:t xml:space="preserve">1.8.4</w:t>
+        <w:t xml:space="preserve">8.4</w:t>
       </w:r>
       <w:r>
         <w:tab/>
@@ -8333,9 +9303,8 @@
         <w:t xml:space="preserve">Sprint H0 clôturé (6/6), Phase 1 à ~82 %</w:t>
       </w:r>
     </w:p>
-    <w:bookmarkEnd w:id="119"/>
-    <w:bookmarkEnd w:id="120"/>
-    <w:bookmarkEnd w:id="121"/>
+    <w:bookmarkEnd w:id="162"/>
+    <w:bookmarkEnd w:id="163"/>
     <w:sectPr>
       <w:footnotePr>
         <w:numRestart w:val="eachSect"/>

</xml_diff>